<commit_message>
Lastenheft: add Executive Summary with delivered services (65 PT effort)
- management summary at the top: context, what P3 Group delivered, status,
  effort breakdown by deliverable/role (Requirements Eng. 31 / Solution Arch. 32
  / Designworkshop 2 = 65 days), outlook
- regenerate PDF (25 p.) and DOCX

Co-Authored-By: Claude Opus 4.8 (1M context) <noreply@anthropic.com>
</commit_message>
<xml_diff>
--- a/docs/LASTENHEFT.docx
+++ b/docs/LASTENHEFT.docx
@@ -356,6 +356,1053 @@
           <w:color w:val="131226"/>
         </w:rPr>
         <w:t xml:space="preserve">Vertraulich – nur für den internen Gebrauch</w:t>
+      </w:r>
+    </w:p>
+    <w:p>
+      <w:pPr/>
+      <w:r>
+        <w:rPr>
+          <w:rFonts w:ascii="Helvetica" w:hAnsi="Helvetica" w:cs="Helvetica"/>
+          <w:sz w:val="29"/>
+          <w:sz-cs w:val="29"/>
+          <w:spacing w:val="0"/>
+          <w:color w:val="6D6D6D"/>
+        </w:rPr>
+        <w:t xml:space="preserve"/>
+      </w:r>
+    </w:p>
+    <w:p>
+      <w:pPr>
+        <w:spacing w:after="354"/>
+      </w:pPr>
+      <w:r>
+        <w:rPr>
+          <w:rFonts w:ascii="Helvetica" w:hAnsi="Helvetica" w:cs="Helvetica"/>
+          <w:sz w:val="42"/>
+          <w:sz-cs w:val="42"/>
+          <w:b/>
+          <w:spacing w:val="0"/>
+          <w:color w:val="000022"/>
+        </w:rPr>
+        <w:t xml:space="preserve">Executive Summary</w:t>
+      </w:r>
+    </w:p>
+    <w:p>
+      <w:pPr>
+        <w:spacing w:after="293"/>
+      </w:pPr>
+      <w:r>
+        <w:rPr>
+          <w:rFonts w:ascii="Helvetica" w:hAnsi="Helvetica" w:cs="Helvetica"/>
+          <w:sz w:val="29"/>
+          <w:sz-cs w:val="29"/>
+          <w:b/>
+          <w:spacing w:val="0"/>
+          <w:color w:val="131226"/>
+        </w:rPr>
+        <w:t xml:space="preserve">Ausgangslage &amp; Auftrag.</w:t>
+      </w:r>
+      <w:r>
+        <w:rPr>
+          <w:rFonts w:ascii="Helvetica" w:hAnsi="Helvetica" w:cs="Helvetica"/>
+          <w:sz w:val="29"/>
+          <w:sz-cs w:val="29"/>
+          <w:spacing w:val="0"/>
+          <w:color w:val="131226"/>
+        </w:rPr>
+        <w:t xml:space="preserve"> Die Software-Freigabe der BMW-Hochvoltspeicher (HVS) in der Abteilung ES-6 wird heute in einer manuell gepflegten Excel-Datei verfolgt — nicht mehrbenutzerfähig, fehleranfällig und von den Quellsystemen (IP3/CDH, Stücklisten, DEEP, WMM, Jira, MIA) entkoppelt. P3 Group wurde beauftragt, diese durch die Anwendung </w:t>
+      </w:r>
+      <w:r>
+        <w:rPr>
+          <w:rFonts w:ascii="Helvetica" w:hAnsi="Helvetica" w:cs="Helvetica"/>
+          <w:sz w:val="29"/>
+          <w:sz-cs w:val="29"/>
+          <w:b/>
+          <w:spacing w:val="0"/>
+          <w:color w:val="131226"/>
+        </w:rPr>
+        <w:t xml:space="preserve">FreigabecockpitNEXT</w:t>
+      </w:r>
+      <w:r>
+        <w:rPr>
+          <w:rFonts w:ascii="Helvetica" w:hAnsi="Helvetica" w:cs="Helvetica"/>
+          <w:sz w:val="29"/>
+          <w:sz-cs w:val="29"/>
+          <w:spacing w:val="0"/>
+          <w:color w:val="131226"/>
+        </w:rPr>
+        <w:t xml:space="preserve"> zu ersetzen: eine zentrale, in Microsoft Dataverse verankerte App, die Daten automatisiert aus den Quellsystemen bezieht, die Freigabetermine im User-Interface bestätigen lässt und anschließend die nachgelagerten Zielsysteme befüllt.</w:t>
+      </w:r>
+    </w:p>
+    <w:p>
+      <w:pPr>
+        <w:spacing w:after="293"/>
+      </w:pPr>
+      <w:r>
+        <w:rPr>
+          <w:rFonts w:ascii="Helvetica" w:hAnsi="Helvetica" w:cs="Helvetica"/>
+          <w:sz w:val="29"/>
+          <w:sz-cs w:val="29"/>
+          <w:b/>
+          <w:spacing w:val="0"/>
+          <w:color w:val="131226"/>
+        </w:rPr>
+        <w:t xml:space="preserve">Was P3 Group geliefert hat.</w:t>
+      </w:r>
+      <w:r>
+        <w:rPr>
+          <w:rFonts w:ascii="Helvetica" w:hAnsi="Helvetica" w:cs="Helvetica"/>
+          <w:sz w:val="29"/>
+          <w:sz-cs w:val="29"/>
+          <w:spacing w:val="0"/>
+          <w:color w:val="131226"/>
+        </w:rPr>
+        <w:t xml:space="preserve"> Im bisherigen Leistungsumfang von </w:t>
+      </w:r>
+      <w:r>
+        <w:rPr>
+          <w:rFonts w:ascii="Helvetica" w:hAnsi="Helvetica" w:cs="Helvetica"/>
+          <w:sz w:val="29"/>
+          <w:sz-cs w:val="29"/>
+          <w:b/>
+          <w:spacing w:val="0"/>
+          <w:color w:val="131226"/>
+        </w:rPr>
+        <w:t xml:space="preserve">65 Personentagen</w:t>
+      </w:r>
+      <w:r>
+        <w:rPr>
+          <w:rFonts w:ascii="Helvetica" w:hAnsi="Helvetica" w:cs="Helvetica"/>
+          <w:sz w:val="29"/>
+          <w:sz-cs w:val="29"/>
+          <w:spacing w:val="0"/>
+          <w:color w:val="131226"/>
+        </w:rPr>
+        <w:t xml:space="preserve"> wurden erbracht:</w:t>
+      </w:r>
+    </w:p>
+    <w:p>
+      <w:pPr>
+        <w:ind w:left="720" w:first-line="-720"/>
+      </w:pPr>
+      <w:r>
+        <w:rPr>
+          <w:rFonts w:ascii="Helvetica" w:hAnsi="Helvetica" w:cs="Helvetica"/>
+          <w:sz w:val="29"/>
+          <w:sz-cs w:val="29"/>
+          <w:b/>
+          <w:color w:val="131226"/>
+        </w:rPr>
+        <w:t xml:space="preserve"/>
+        <w:tab/>
+        <w:t xml:space="preserve">•</w:t>
+        <w:tab/>
+        <w:t xml:space="preserve"/>
+      </w:r>
+      <w:r>
+        <w:rPr>
+          <w:rFonts w:ascii="Helvetica" w:hAnsi="Helvetica" w:cs="Helvetica"/>
+          <w:sz w:val="29"/>
+          <w:sz-cs w:val="29"/>
+          <w:b/>
+          <w:spacing w:val="0"/>
+          <w:color w:val="131226"/>
+        </w:rPr>
+        <w:t xml:space="preserve">Vollständige Anforderungsaufnahme &amp; Spezifikation</w:t>
+      </w:r>
+      <w:r>
+        <w:rPr>
+          <w:rFonts w:ascii="Helvetica" w:hAnsi="Helvetica" w:cs="Helvetica"/>
+          <w:sz w:val="29"/>
+          <w:sz-cs w:val="29"/>
+          <w:spacing w:val="0"/>
+          <w:color w:val="131226"/>
+        </w:rPr>
+        <w:t xml:space="preserve"> — das vorliegende Lastenheft mit Datenmodell, Quell-/Zielsystem-Landschaft, vollständigem Kundenanforderungskatalog inkl. Umsetzungsbewertung und dem Epic-/Feature-Backlog (E0–E7).</w:t>
+      </w:r>
+    </w:p>
+    <w:p>
+      <w:pPr>
+        <w:ind w:left="720" w:first-line="-720"/>
+      </w:pPr>
+      <w:r>
+        <w:rPr>
+          <w:rFonts w:ascii="Helvetica" w:hAnsi="Helvetica" w:cs="Helvetica"/>
+          <w:sz w:val="29"/>
+          <w:sz-cs w:val="29"/>
+          <w:b/>
+          <w:color w:val="131226"/>
+        </w:rPr>
+        <w:t xml:space="preserve"/>
+        <w:tab/>
+        <w:t xml:space="preserve">•</w:t>
+        <w:tab/>
+        <w:t xml:space="preserve"/>
+      </w:r>
+      <w:r>
+        <w:rPr>
+          <w:rFonts w:ascii="Helvetica" w:hAnsi="Helvetica" w:cs="Helvetica"/>
+          <w:sz w:val="29"/>
+          <w:sz-cs w:val="29"/>
+          <w:b/>
+          <w:spacing w:val="0"/>
+          <w:color w:val="131226"/>
+        </w:rPr>
+        <w:t xml:space="preserve">Lauffähiger App-Prototyp</w:t>
+      </w:r>
+      <w:r>
+        <w:rPr>
+          <w:rFonts w:ascii="Helvetica" w:hAnsi="Helvetica" w:cs="Helvetica"/>
+          <w:sz w:val="29"/>
+          <w:sz-cs w:val="29"/>
+          <w:spacing w:val="0"/>
+          <w:color w:val="131226"/>
+        </w:rPr>
+        <w:t xml:space="preserve"> (Power Apps Code App auf Microsoft Dataverse) mit vier Arbeitsbereichen: aktionsorientiertes </w:t>
+      </w:r>
+      <w:r>
+        <w:rPr>
+          <w:rFonts w:ascii="Helvetica" w:hAnsi="Helvetica" w:cs="Helvetica"/>
+          <w:sz w:val="29"/>
+          <w:sz-cs w:val="29"/>
+          <w:b/>
+          <w:spacing w:val="0"/>
+          <w:color w:val="131226"/>
+        </w:rPr>
+        <w:t xml:space="preserve">Cockpit</w:t>
+      </w:r>
+      <w:r>
+        <w:rPr>
+          <w:rFonts w:ascii="Helvetica" w:hAnsi="Helvetica" w:cs="Helvetica"/>
+          <w:sz w:val="29"/>
+          <w:sz-cs w:val="29"/>
+          <w:spacing w:val="0"/>
+          <w:color w:val="131226"/>
+        </w:rPr>
+        <w:t xml:space="preserve">, </w:t>
+      </w:r>
+      <w:r>
+        <w:rPr>
+          <w:rFonts w:ascii="Helvetica" w:hAnsi="Helvetica" w:cs="Helvetica"/>
+          <w:sz w:val="29"/>
+          <w:sz-cs w:val="29"/>
+          <w:b/>
+          <w:spacing w:val="0"/>
+          <w:color w:val="131226"/>
+        </w:rPr>
+        <w:t xml:space="preserve">Freigabe-Timeline</w:t>
+      </w:r>
+      <w:r>
+        <w:rPr>
+          <w:rFonts w:ascii="Helvetica" w:hAnsi="Helvetica" w:cs="Helvetica"/>
+          <w:sz w:val="29"/>
+          <w:sz-cs w:val="29"/>
+          <w:spacing w:val="0"/>
+          <w:color w:val="131226"/>
+        </w:rPr>
+        <w:t xml:space="preserve"> (Gantt-Übersicht), </w:t>
+      </w:r>
+      <w:r>
+        <w:rPr>
+          <w:rFonts w:ascii="Helvetica" w:hAnsi="Helvetica" w:cs="Helvetica"/>
+          <w:sz w:val="29"/>
+          <w:sz-cs w:val="29"/>
+          <w:b/>
+          <w:spacing w:val="0"/>
+          <w:color w:val="131226"/>
+        </w:rPr>
+        <w:t xml:space="preserve">Verschränkungen</w:t>
+      </w:r>
+      <w:r>
+        <w:rPr>
+          <w:rFonts w:ascii="Helvetica" w:hAnsi="Helvetica" w:cs="Helvetica"/>
+          <w:sz w:val="29"/>
+          <w:sz-cs w:val="29"/>
+          <w:spacing w:val="0"/>
+          <w:color w:val="131226"/>
+        </w:rPr>
+        <w:t xml:space="preserve"> und </w:t>
+      </w:r>
+      <w:r>
+        <w:rPr>
+          <w:rFonts w:ascii="Helvetica" w:hAnsi="Helvetica" w:cs="Helvetica"/>
+          <w:sz w:val="29"/>
+          <w:sz-cs w:val="29"/>
+          <w:b/>
+          <w:spacing w:val="0"/>
+          <w:color w:val="131226"/>
+        </w:rPr>
+        <w:t xml:space="preserve">Dataverse-Verwaltung</w:t>
+      </w:r>
+      <w:r>
+        <w:rPr>
+          <w:rFonts w:ascii="Helvetica" w:hAnsi="Helvetica" w:cs="Helvetica"/>
+          <w:sz w:val="29"/>
+          <w:sz-cs w:val="29"/>
+          <w:spacing w:val="0"/>
+          <w:color w:val="131226"/>
+        </w:rPr>
+        <w:t xml:space="preserve">.</w:t>
+      </w:r>
+    </w:p>
+    <w:p>
+      <w:pPr>
+        <w:ind w:left="720" w:first-line="-720"/>
+      </w:pPr>
+      <w:r>
+        <w:rPr>
+          <w:rFonts w:ascii="Helvetica" w:hAnsi="Helvetica" w:cs="Helvetica"/>
+          <w:sz w:val="29"/>
+          <w:sz-cs w:val="29"/>
+          <w:b/>
+          <w:color w:val="131226"/>
+        </w:rPr>
+        <w:t xml:space="preserve"/>
+        <w:tab/>
+        <w:t xml:space="preserve">•</w:t>
+        <w:tab/>
+        <w:t xml:space="preserve"/>
+      </w:r>
+      <w:r>
+        <w:rPr>
+          <w:rFonts w:ascii="Helvetica" w:hAnsi="Helvetica" w:cs="Helvetica"/>
+          <w:sz w:val="29"/>
+          <w:sz-cs w:val="29"/>
+          <w:b/>
+          <w:spacing w:val="0"/>
+          <w:color w:val="131226"/>
+        </w:rPr>
+        <w:t xml:space="preserve">Automatisierte Datenpipeline „FGC_DATA"</w:t>
+      </w:r>
+      <w:r>
+        <w:rPr>
+          <w:rFonts w:ascii="Helvetica" w:hAnsi="Helvetica" w:cs="Helvetica"/>
+          <w:sz w:val="29"/>
+          <w:sz-cs w:val="29"/>
+          <w:spacing w:val="0"/>
+          <w:color w:val="131226"/>
+        </w:rPr>
+        <w:t xml:space="preserve"> — ETL der Quelldaten (IP3, Stücklisten, DEEP) nach Dataverse, inklusive Kalenderwochen- und I-Stufen-Logik.</w:t>
+      </w:r>
+    </w:p>
+    <w:p>
+      <w:pPr>
+        <w:ind w:left="720" w:first-line="-720"/>
+      </w:pPr>
+      <w:r>
+        <w:rPr>
+          <w:rFonts w:ascii="Helvetica" w:hAnsi="Helvetica" w:cs="Helvetica"/>
+          <w:sz w:val="29"/>
+          <w:sz-cs w:val="29"/>
+          <w:b/>
+          <w:color w:val="131226"/>
+        </w:rPr>
+        <w:t xml:space="preserve"/>
+        <w:tab/>
+        <w:t xml:space="preserve">•</w:t>
+        <w:tab/>
+        <w:t xml:space="preserve"/>
+      </w:r>
+      <w:r>
+        <w:rPr>
+          <w:rFonts w:ascii="Helvetica" w:hAnsi="Helvetica" w:cs="Helvetica"/>
+          <w:sz w:val="29"/>
+          <w:sz-cs w:val="29"/>
+          <w:b/>
+          <w:spacing w:val="0"/>
+          <w:color w:val="131226"/>
+        </w:rPr>
+        <w:t xml:space="preserve">Kern-Funktionalität der Freigabeplanung</w:t>
+      </w:r>
+      <w:r>
+        <w:rPr>
+          <w:rFonts w:ascii="Helvetica" w:hAnsi="Helvetica" w:cs="Helvetica"/>
+          <w:sz w:val="29"/>
+          <w:sz-cs w:val="29"/>
+          <w:spacing w:val="0"/>
+          <w:color w:val="131226"/>
+        </w:rPr>
+        <w:t xml:space="preserve">: Übersichtsgrid (HVS × Kalenderwoche), komplexe Live-Filterung, Batch-Change / Bulk-Freigabe, Terminverschiebung, Soll-/Ist-Verfolgung sowie die WMM-Prüf- und Delta-Logik.</w:t>
+      </w:r>
+    </w:p>
+    <w:p>
+      <w:pPr>
+        <w:ind w:left="720" w:first-line="-720"/>
+      </w:pPr>
+      <w:r>
+        <w:rPr>
+          <w:rFonts w:ascii="Helvetica" w:hAnsi="Helvetica" w:cs="Helvetica"/>
+          <w:sz w:val="29"/>
+          <w:sz-cs w:val="29"/>
+          <w:b/>
+          <w:color w:val="131226"/>
+        </w:rPr>
+        <w:t xml:space="preserve"/>
+        <w:tab/>
+        <w:t xml:space="preserve">•</w:t>
+        <w:tab/>
+        <w:t xml:space="preserve"/>
+      </w:r>
+      <w:r>
+        <w:rPr>
+          <w:rFonts w:ascii="Helvetica" w:hAnsi="Helvetica" w:cs="Helvetica"/>
+          <w:sz w:val="29"/>
+          <w:sz-cs w:val="29"/>
+          <w:b/>
+          <w:spacing w:val="0"/>
+          <w:color w:val="131226"/>
+        </w:rPr>
+        <w:t xml:space="preserve">Visuelle Architektur</w:t>
+      </w:r>
+      <w:r>
+        <w:rPr>
+          <w:rFonts w:ascii="Helvetica" w:hAnsi="Helvetica" w:cs="Helvetica"/>
+          <w:sz w:val="29"/>
+          <w:sz-cs w:val="29"/>
+          <w:spacing w:val="0"/>
+          <w:color w:val="131226"/>
+        </w:rPr>
+        <w:t xml:space="preserve">: Datenmodell als ER-Diagramm (Abb. 1) und End-to-End-Prozessskizze (Abb. 2).</w:t>
+      </w:r>
+    </w:p>
+    <w:p>
+      <w:pPr>
+        <w:spacing w:after="293"/>
+      </w:pPr>
+      <w:r>
+        <w:rPr>
+          <w:rFonts w:ascii="Helvetica" w:hAnsi="Helvetica" w:cs="Helvetica"/>
+          <w:sz w:val="29"/>
+          <w:sz-cs w:val="29"/>
+          <w:b/>
+          <w:spacing w:val="0"/>
+          <w:color w:val="131226"/>
+        </w:rPr>
+        <w:t xml:space="preserve">Umsetzungsstand.</w:t>
+      </w:r>
+      <w:r>
+        <w:rPr>
+          <w:rFonts w:ascii="Helvetica" w:hAnsi="Helvetica" w:cs="Helvetica"/>
+          <w:sz w:val="29"/>
+          <w:sz-cs w:val="29"/>
+          <w:spacing w:val="0"/>
+          <w:color w:val="131226"/>
+        </w:rPr>
+        <w:t xml:space="preserve"> Der gesamte </w:t>
+      </w:r>
+      <w:r>
+        <w:rPr>
+          <w:rFonts w:ascii="Helvetica" w:hAnsi="Helvetica" w:cs="Helvetica"/>
+          <w:sz w:val="29"/>
+          <w:sz-cs w:val="29"/>
+          <w:b/>
+          <w:spacing w:val="0"/>
+          <w:color w:val="131226"/>
+        </w:rPr>
+        <w:t xml:space="preserve">interne Planungs- und Pflege-Kern</w:t>
+      </w:r>
+      <w:r>
+        <w:rPr>
+          <w:rFonts w:ascii="Helvetica" w:hAnsi="Helvetica" w:cs="Helvetica"/>
+          <w:sz w:val="29"/>
+          <w:sz-cs w:val="29"/>
+          <w:spacing w:val="0"/>
+          <w:color w:val="131226"/>
+        </w:rPr>
+        <w:t xml:space="preserve"> ist umgesetzt und demonstrierbar. Die Funktionen, die eine </w:t>
+      </w:r>
+      <w:r>
+        <w:rPr>
+          <w:rFonts w:ascii="Helvetica" w:hAnsi="Helvetica" w:cs="Helvetica"/>
+          <w:sz w:val="29"/>
+          <w:sz-cs w:val="29"/>
+          <w:b/>
+          <w:spacing w:val="0"/>
+          <w:color w:val="131226"/>
+        </w:rPr>
+        <w:t xml:space="preserve">produktive Live-Anbindung externer Systeme</w:t>
+      </w:r>
+      <w:r>
+        <w:rPr>
+          <w:rFonts w:ascii="Helvetica" w:hAnsi="Helvetica" w:cs="Helvetica"/>
+          <w:sz w:val="29"/>
+          <w:sz-cs w:val="29"/>
+          <w:spacing w:val="0"/>
+          <w:color w:val="131226"/>
+        </w:rPr>
+        <w:t xml:space="preserve"> voraussetzen — WMM/BATKAS·IHP, IP3-Polling, Jira-Ticketerzeugung und MIA-Anlagen — sind fachlich vollständig spezifiziert und im UI vorbereitet, ihre Aktivierung hängt jedoch an den noch herzustellenden Systemzugängen. Die offenen Punkte sind damit </w:t>
+      </w:r>
+      <w:r>
+        <w:rPr>
+          <w:rFonts w:ascii="Helvetica" w:hAnsi="Helvetica" w:cs="Helvetica"/>
+          <w:sz w:val="29"/>
+          <w:sz-cs w:val="29"/>
+          <w:b/>
+          <w:spacing w:val="0"/>
+          <w:color w:val="131226"/>
+        </w:rPr>
+        <w:t xml:space="preserve">nicht durch die Anwendung limitiert, sondern durch die externen Schnittstellen</w:t>
+      </w:r>
+      <w:r>
+        <w:rPr>
+          <w:rFonts w:ascii="Helvetica" w:hAnsi="Helvetica" w:cs="Helvetica"/>
+          <w:sz w:val="29"/>
+          <w:sz-cs w:val="29"/>
+          <w:spacing w:val="0"/>
+          <w:color w:val="131226"/>
+        </w:rPr>
+        <w:t xml:space="preserve"> (Details in §9 und §11).</w:t>
+      </w:r>
+    </w:p>
+    <w:p>
+      <w:pPr>
+        <w:spacing w:after="293"/>
+      </w:pPr>
+      <w:r>
+        <w:rPr>
+          <w:rFonts w:ascii="Helvetica" w:hAnsi="Helvetica" w:cs="Helvetica"/>
+          <w:sz w:val="29"/>
+          <w:sz-cs w:val="29"/>
+          <w:b/>
+          <w:spacing w:val="0"/>
+          <w:color w:val="131226"/>
+        </w:rPr>
+        <w:t xml:space="preserve">Erbrachte Leistung nach Liefergegenständen.</w:t>
+      </w:r>
+      <w:r>
+        <w:rPr>
+          <w:rFonts w:ascii="Helvetica" w:hAnsi="Helvetica" w:cs="Helvetica"/>
+          <w:sz w:val="29"/>
+          <w:sz-cs w:val="29"/>
+          <w:spacing w:val="0"/>
+          <w:color w:val="131226"/>
+        </w:rPr>
+        <w:t xml:space="preserve"> Der Leistungsumfang verteilt sich auf </w:t>
+      </w:r>
+      <w:r>
+        <w:rPr>
+          <w:rFonts w:ascii="Helvetica" w:hAnsi="Helvetica" w:cs="Helvetica"/>
+          <w:sz w:val="29"/>
+          <w:sz-cs w:val="29"/>
+          <w:b/>
+          <w:spacing w:val="0"/>
+          <w:color w:val="131226"/>
+        </w:rPr>
+        <w:t xml:space="preserve">Requirements Engineering (31 Tage)</w:t>
+      </w:r>
+      <w:r>
+        <w:rPr>
+          <w:rFonts w:ascii="Helvetica" w:hAnsi="Helvetica" w:cs="Helvetica"/>
+          <w:sz w:val="29"/>
+          <w:sz-cs w:val="29"/>
+          <w:spacing w:val="0"/>
+          <w:color w:val="131226"/>
+        </w:rPr>
+        <w:t xml:space="preserve">, </w:t>
+      </w:r>
+      <w:r>
+        <w:rPr>
+          <w:rFonts w:ascii="Helvetica" w:hAnsi="Helvetica" w:cs="Helvetica"/>
+          <w:sz w:val="29"/>
+          <w:sz-cs w:val="29"/>
+          <w:b/>
+          <w:spacing w:val="0"/>
+          <w:color w:val="131226"/>
+        </w:rPr>
+        <w:t xml:space="preserve">Solution Architecture (32 Tage)</w:t>
+      </w:r>
+      <w:r>
+        <w:rPr>
+          <w:rFonts w:ascii="Helvetica" w:hAnsi="Helvetica" w:cs="Helvetica"/>
+          <w:sz w:val="29"/>
+          <w:sz-cs w:val="29"/>
+          <w:spacing w:val="0"/>
+          <w:color w:val="131226"/>
+        </w:rPr>
+        <w:t xml:space="preserve"> und einen gemeinsamen </w:t>
+      </w:r>
+      <w:r>
+        <w:rPr>
+          <w:rFonts w:ascii="Helvetica" w:hAnsi="Helvetica" w:cs="Helvetica"/>
+          <w:sz w:val="29"/>
+          <w:sz-cs w:val="29"/>
+          <w:b/>
+          <w:spacing w:val="0"/>
+          <w:color w:val="131226"/>
+        </w:rPr>
+        <w:t xml:space="preserve">Designworkshop (2 Tage)</w:t>
+      </w:r>
+      <w:r>
+        <w:rPr>
+          <w:rFonts w:ascii="Helvetica" w:hAnsi="Helvetica" w:cs="Helvetica"/>
+          <w:sz w:val="29"/>
+          <w:sz-cs w:val="29"/>
+          <w:spacing w:val="0"/>
+          <w:color w:val="131226"/>
+        </w:rPr>
+        <w:t xml:space="preserve"> — in Summe </w:t>
+      </w:r>
+      <w:r>
+        <w:rPr>
+          <w:rFonts w:ascii="Helvetica" w:hAnsi="Helvetica" w:cs="Helvetica"/>
+          <w:sz w:val="29"/>
+          <w:sz-cs w:val="29"/>
+          <w:b/>
+          <w:spacing w:val="0"/>
+          <w:color w:val="131226"/>
+        </w:rPr>
+        <w:t xml:space="preserve">65 Tage</w:t>
+      </w:r>
+      <w:r>
+        <w:rPr>
+          <w:rFonts w:ascii="Helvetica" w:hAnsi="Helvetica" w:cs="Helvetica"/>
+          <w:sz w:val="29"/>
+          <w:sz-cs w:val="29"/>
+          <w:spacing w:val="0"/>
+          <w:color w:val="131226"/>
+        </w:rPr>
+        <w:t xml:space="preserve">:</w:t>
+      </w:r>
+    </w:p>
+    <w:p>
+      <w:pPr/>
+      <w:r>
+        <w:rPr>
+          <w:rFonts w:ascii="Helvetica" w:hAnsi="Helvetica" w:cs="Helvetica"/>
+          <w:sz w:val="29"/>
+          <w:sz-cs w:val="29"/>
+          <w:b/>
+          <w:spacing w:val="0"/>
+          <w:color w:val="FFFFFF"/>
+        </w:rPr>
+        <w:t xml:space="preserve">Liefergegenstand</w:t>
+      </w:r>
+    </w:p>
+    <w:p>
+      <w:pPr/>
+      <w:r>
+        <w:rPr>
+          <w:rFonts w:ascii="Helvetica" w:hAnsi="Helvetica" w:cs="Helvetica"/>
+          <w:sz w:val="29"/>
+          <w:sz-cs w:val="29"/>
+          <w:b/>
+          <w:spacing w:val="0"/>
+          <w:color w:val="FFFFFF"/>
+        </w:rPr>
+        <w:t xml:space="preserve">Aufwand</w:t>
+      </w:r>
+    </w:p>
+    <w:p>
+      <w:pPr/>
+      <w:r>
+        <w:rPr>
+          <w:rFonts w:ascii="Helvetica" w:hAnsi="Helvetica" w:cs="Helvetica"/>
+          <w:sz w:val="29"/>
+          <w:sz-cs w:val="29"/>
+          <w:b/>
+          <w:spacing w:val="0"/>
+          <w:color w:val="FFFFFF"/>
+        </w:rPr>
+        <w:t xml:space="preserve">Rolle</w:t>
+      </w:r>
+    </w:p>
+    <w:p>
+      <w:pPr/>
+      <w:r>
+        <w:rPr>
+          <w:rFonts w:ascii="Helvetica" w:hAnsi="Helvetica" w:cs="Helvetica"/>
+          <w:sz w:val="29"/>
+          <w:sz-cs w:val="29"/>
+          <w:spacing w:val="0"/>
+          <w:color w:val="131226"/>
+        </w:rPr>
+        <w:t xml:space="preserve">Projektanalyse und -planung</w:t>
+      </w:r>
+    </w:p>
+    <w:p>
+      <w:pPr/>
+      <w:r>
+        <w:rPr>
+          <w:rFonts w:ascii="Helvetica" w:hAnsi="Helvetica" w:cs="Helvetica"/>
+          <w:sz w:val="29"/>
+          <w:sz-cs w:val="29"/>
+          <w:spacing w:val="0"/>
+          <w:color w:val="131226"/>
+        </w:rPr>
+        <w:t xml:space="preserve">5 Tage</w:t>
+      </w:r>
+    </w:p>
+    <w:p>
+      <w:pPr/>
+      <w:r>
+        <w:rPr>
+          <w:rFonts w:ascii="Helvetica" w:hAnsi="Helvetica" w:cs="Helvetica"/>
+          <w:sz w:val="29"/>
+          <w:sz-cs w:val="29"/>
+          <w:spacing w:val="0"/>
+          <w:color w:val="131226"/>
+        </w:rPr>
+        <w:t xml:space="preserve">Senior Requirement Engineer</w:t>
+      </w:r>
+    </w:p>
+    <w:p>
+      <w:pPr/>
+      <w:r>
+        <w:rPr>
+          <w:rFonts w:ascii="Helvetica" w:hAnsi="Helvetica" w:cs="Helvetica"/>
+          <w:sz w:val="29"/>
+          <w:sz-cs w:val="29"/>
+          <w:spacing w:val="0"/>
+          <w:color w:val="131226"/>
+        </w:rPr>
+        <w:t xml:space="preserve">Projektmanagement</w:t>
+      </w:r>
+    </w:p>
+    <w:p>
+      <w:pPr/>
+      <w:r>
+        <w:rPr>
+          <w:rFonts w:ascii="Helvetica" w:hAnsi="Helvetica" w:cs="Helvetica"/>
+          <w:sz w:val="29"/>
+          <w:sz-cs w:val="29"/>
+          <w:spacing w:val="0"/>
+          <w:color w:val="131226"/>
+        </w:rPr>
+        <w:t xml:space="preserve">2 Tage</w:t>
+      </w:r>
+    </w:p>
+    <w:p>
+      <w:pPr/>
+      <w:r>
+        <w:rPr>
+          <w:rFonts w:ascii="Helvetica" w:hAnsi="Helvetica" w:cs="Helvetica"/>
+          <w:sz w:val="29"/>
+          <w:sz-cs w:val="29"/>
+          <w:spacing w:val="0"/>
+          <w:color w:val="131226"/>
+        </w:rPr>
+        <w:t xml:space="preserve">Senior Requirement Engineer</w:t>
+      </w:r>
+    </w:p>
+    <w:p>
+      <w:pPr/>
+      <w:r>
+        <w:rPr>
+          <w:rFonts w:ascii="Helvetica" w:hAnsi="Helvetica" w:cs="Helvetica"/>
+          <w:sz w:val="29"/>
+          <w:sz-cs w:val="29"/>
+          <w:spacing w:val="0"/>
+          <w:color w:val="131226"/>
+        </w:rPr>
+        <w:t xml:space="preserve">Anforderungsaufnahme und Backlogmanagement</w:t>
+      </w:r>
+    </w:p>
+    <w:p>
+      <w:pPr/>
+      <w:r>
+        <w:rPr>
+          <w:rFonts w:ascii="Helvetica" w:hAnsi="Helvetica" w:cs="Helvetica"/>
+          <w:sz w:val="29"/>
+          <w:sz-cs w:val="29"/>
+          <w:spacing w:val="0"/>
+          <w:color w:val="131226"/>
+        </w:rPr>
+        <w:t xml:space="preserve">17 Tage</w:t>
+      </w:r>
+    </w:p>
+    <w:p>
+      <w:pPr/>
+      <w:r>
+        <w:rPr>
+          <w:rFonts w:ascii="Helvetica" w:hAnsi="Helvetica" w:cs="Helvetica"/>
+          <w:sz w:val="29"/>
+          <w:sz-cs w:val="29"/>
+          <w:spacing w:val="0"/>
+          <w:color w:val="131226"/>
+        </w:rPr>
+        <w:t xml:space="preserve">Senior Requirement Engineer</w:t>
+      </w:r>
+    </w:p>
+    <w:p>
+      <w:pPr/>
+      <w:r>
+        <w:rPr>
+          <w:rFonts w:ascii="Helvetica" w:hAnsi="Helvetica" w:cs="Helvetica"/>
+          <w:sz w:val="29"/>
+          <w:sz-cs w:val="29"/>
+          <w:spacing w:val="0"/>
+          <w:color w:val="131226"/>
+        </w:rPr>
+        <w:t xml:space="preserve">Schnittstellen- und Systemsondierungen</w:t>
+      </w:r>
+    </w:p>
+    <w:p>
+      <w:pPr/>
+      <w:r>
+        <w:rPr>
+          <w:rFonts w:ascii="Helvetica" w:hAnsi="Helvetica" w:cs="Helvetica"/>
+          <w:sz w:val="29"/>
+          <w:sz-cs w:val="29"/>
+          <w:spacing w:val="0"/>
+          <w:color w:val="131226"/>
+        </w:rPr>
+        <w:t xml:space="preserve">7 Tage</w:t>
+      </w:r>
+    </w:p>
+    <w:p>
+      <w:pPr/>
+      <w:r>
+        <w:rPr>
+          <w:rFonts w:ascii="Helvetica" w:hAnsi="Helvetica" w:cs="Helvetica"/>
+          <w:sz w:val="29"/>
+          <w:sz-cs w:val="29"/>
+          <w:spacing w:val="0"/>
+          <w:color w:val="131226"/>
+        </w:rPr>
+        <w:t xml:space="preserve">Senior Requirement Engineer</w:t>
+      </w:r>
+    </w:p>
+    <w:p>
+      <w:pPr/>
+      <w:r>
+        <w:rPr>
+          <w:rFonts w:ascii="Helvetica" w:hAnsi="Helvetica" w:cs="Helvetica"/>
+          <w:sz w:val="29"/>
+          <w:sz-cs w:val="29"/>
+          <w:spacing w:val="0"/>
+          <w:color w:val="131226"/>
+        </w:rPr>
+        <w:t xml:space="preserve">Mockup-Erstellung initiales Konzept</w:t>
+      </w:r>
+    </w:p>
+    <w:p>
+      <w:pPr/>
+      <w:r>
+        <w:rPr>
+          <w:rFonts w:ascii="Helvetica" w:hAnsi="Helvetica" w:cs="Helvetica"/>
+          <w:sz w:val="29"/>
+          <w:sz-cs w:val="29"/>
+          <w:spacing w:val="0"/>
+          <w:color w:val="131226"/>
+        </w:rPr>
+        <w:t xml:space="preserve">5 Tage</w:t>
+      </w:r>
+    </w:p>
+    <w:p>
+      <w:pPr/>
+      <w:r>
+        <w:rPr>
+          <w:rFonts w:ascii="Helvetica" w:hAnsi="Helvetica" w:cs="Helvetica"/>
+          <w:sz w:val="29"/>
+          <w:sz-cs w:val="29"/>
+          <w:spacing w:val="0"/>
+          <w:color w:val="131226"/>
+        </w:rPr>
+        <w:t xml:space="preserve">Senior Solution Architect</w:t>
+      </w:r>
+    </w:p>
+    <w:p>
+      <w:pPr/>
+      <w:r>
+        <w:rPr>
+          <w:rFonts w:ascii="Helvetica" w:hAnsi="Helvetica" w:cs="Helvetica"/>
+          <w:sz w:val="29"/>
+          <w:sz-cs w:val="29"/>
+          <w:spacing w:val="0"/>
+          <w:color w:val="131226"/>
+        </w:rPr>
+        <w:t xml:space="preserve">Data Engineering und Backend-Konfiguration</w:t>
+      </w:r>
+    </w:p>
+    <w:p>
+      <w:pPr/>
+      <w:r>
+        <w:rPr>
+          <w:rFonts w:ascii="Helvetica" w:hAnsi="Helvetica" w:cs="Helvetica"/>
+          <w:sz w:val="29"/>
+          <w:sz-cs w:val="29"/>
+          <w:spacing w:val="0"/>
+          <w:color w:val="131226"/>
+        </w:rPr>
+        <w:t xml:space="preserve">4 Tage</w:t>
+      </w:r>
+    </w:p>
+    <w:p>
+      <w:pPr/>
+      <w:r>
+        <w:rPr>
+          <w:rFonts w:ascii="Helvetica" w:hAnsi="Helvetica" w:cs="Helvetica"/>
+          <w:sz w:val="29"/>
+          <w:sz-cs w:val="29"/>
+          <w:spacing w:val="0"/>
+          <w:color w:val="131226"/>
+        </w:rPr>
+        <w:t xml:space="preserve">Senior Solution Architect</w:t>
+      </w:r>
+    </w:p>
+    <w:p>
+      <w:pPr/>
+      <w:r>
+        <w:rPr>
+          <w:rFonts w:ascii="Helvetica" w:hAnsi="Helvetica" w:cs="Helvetica"/>
+          <w:sz w:val="29"/>
+          <w:sz-cs w:val="29"/>
+          <w:spacing w:val="0"/>
+          <w:color w:val="131226"/>
+        </w:rPr>
+        <w:t xml:space="preserve">Frontend-Erstellung – iteratives Mockup-Konzept</w:t>
+      </w:r>
+    </w:p>
+    <w:p>
+      <w:pPr/>
+      <w:r>
+        <w:rPr>
+          <w:rFonts w:ascii="Helvetica" w:hAnsi="Helvetica" w:cs="Helvetica"/>
+          <w:sz w:val="29"/>
+          <w:sz-cs w:val="29"/>
+          <w:spacing w:val="0"/>
+          <w:color w:val="131226"/>
+        </w:rPr>
+        <w:t xml:space="preserve">23 Tage</w:t>
+      </w:r>
+    </w:p>
+    <w:p>
+      <w:pPr/>
+      <w:r>
+        <w:rPr>
+          <w:rFonts w:ascii="Helvetica" w:hAnsi="Helvetica" w:cs="Helvetica"/>
+          <w:sz w:val="29"/>
+          <w:sz-cs w:val="29"/>
+          <w:spacing w:val="0"/>
+          <w:color w:val="131226"/>
+        </w:rPr>
+        <w:t xml:space="preserve">Senior Solution Architect</w:t>
+      </w:r>
+    </w:p>
+    <w:p>
+      <w:pPr/>
+      <w:r>
+        <w:rPr>
+          <w:rFonts w:ascii="Helvetica" w:hAnsi="Helvetica" w:cs="Helvetica"/>
+          <w:sz w:val="29"/>
+          <w:sz-cs w:val="29"/>
+          <w:spacing w:val="0"/>
+          <w:color w:val="131226"/>
+        </w:rPr>
+        <w:t xml:space="preserve">Designworkshop</w:t>
+      </w:r>
+    </w:p>
+    <w:p>
+      <w:pPr/>
+      <w:r>
+        <w:rPr>
+          <w:rFonts w:ascii="Helvetica" w:hAnsi="Helvetica" w:cs="Helvetica"/>
+          <w:sz w:val="29"/>
+          <w:sz-cs w:val="29"/>
+          <w:spacing w:val="0"/>
+          <w:color w:val="131226"/>
+        </w:rPr>
+        <w:t xml:space="preserve">2 Tage</w:t>
+      </w:r>
+    </w:p>
+    <w:p>
+      <w:pPr/>
+      <w:r>
+        <w:rPr>
+          <w:rFonts w:ascii="Helvetica" w:hAnsi="Helvetica" w:cs="Helvetica"/>
+          <w:sz w:val="29"/>
+          <w:sz-cs w:val="29"/>
+          <w:spacing w:val="0"/>
+          <w:color w:val="131226"/>
+        </w:rPr>
+        <w:t xml:space="preserve">Senior Solution Architect / Senior Requirement Engineer</w:t>
+      </w:r>
+    </w:p>
+    <w:p>
+      <w:pPr/>
+      <w:r>
+        <w:rPr>
+          <w:rFonts w:ascii="Helvetica" w:hAnsi="Helvetica" w:cs="Helvetica"/>
+          <w:sz w:val="29"/>
+          <w:sz-cs w:val="29"/>
+          <w:b/>
+          <w:spacing w:val="0"/>
+          <w:color w:val="131226"/>
+        </w:rPr>
+        <w:t xml:space="preserve">Gesamtaufwendungen</w:t>
+      </w:r>
+      <w:r>
+        <w:rPr>
+          <w:rFonts w:ascii="Helvetica" w:hAnsi="Helvetica" w:cs="Helvetica"/>
+          <w:sz w:val="29"/>
+          <w:sz-cs w:val="29"/>
+          <w:spacing w:val="0"/>
+          <w:color w:val="131226"/>
+        </w:rPr>
+        <w:t xml:space="preserve"/>
+      </w:r>
+    </w:p>
+    <w:p>
+      <w:pPr/>
+      <w:r>
+        <w:rPr>
+          <w:rFonts w:ascii="Helvetica" w:hAnsi="Helvetica" w:cs="Helvetica"/>
+          <w:sz w:val="29"/>
+          <w:sz-cs w:val="29"/>
+          <w:b/>
+          <w:spacing w:val="0"/>
+          <w:color w:val="131226"/>
+        </w:rPr>
+        <w:t xml:space="preserve">65 Tage</w:t>
+      </w:r>
+      <w:r>
+        <w:rPr>
+          <w:rFonts w:ascii="Helvetica" w:hAnsi="Helvetica" w:cs="Helvetica"/>
+          <w:sz w:val="29"/>
+          <w:sz-cs w:val="29"/>
+          <w:spacing w:val="0"/>
+          <w:color w:val="131226"/>
+        </w:rPr>
+        <w:t xml:space="preserve"/>
+      </w:r>
+    </w:p>
+    <w:p>
+      <w:pPr/>
+      <w:r>
+        <w:rPr>
+          <w:rFonts w:ascii="Helvetica" w:hAnsi="Helvetica" w:cs="Helvetica"/>
+          <w:sz w:val="29"/>
+          <w:sz-cs w:val="29"/>
+          <w:spacing w:val="0"/>
+          <w:color w:val="131226"/>
+        </w:rPr>
+        <w:t xml:space="preserve"/>
+      </w:r>
+    </w:p>
+    <w:p>
+      <w:pPr>
+        <w:spacing w:after="293"/>
+      </w:pPr>
+      <w:r>
+        <w:rPr>
+          <w:rFonts w:ascii="Helvetica" w:hAnsi="Helvetica" w:cs="Helvetica"/>
+          <w:sz w:val="29"/>
+          <w:sz-cs w:val="29"/>
+          <w:b/>
+          <w:spacing w:val="0"/>
+          <w:color w:val="131226"/>
+        </w:rPr>
+        <w:t xml:space="preserve">Ausblick.</w:t>
+      </w:r>
+      <w:r>
+        <w:rPr>
+          <w:rFonts w:ascii="Helvetica" w:hAnsi="Helvetica" w:cs="Helvetica"/>
+          <w:sz w:val="29"/>
+          <w:sz-cs w:val="29"/>
+          <w:spacing w:val="0"/>
+          <w:color w:val="131226"/>
+        </w:rPr>
+        <w:t xml:space="preserve"> Mit der abgestimmten Spezifikation und dem lauffähigen Prototyp ist die Grundlage gelegt, um in der Folgephase die externen Schnittstellen (CDH, Jira, MIA, WMM) anzubinden und die Automatisierung durchgängig (end-to-end) zu produktivieren.</w:t>
       </w:r>
     </w:p>
     <w:p>

</xml_diff>

<commit_message>
Lastenheft: rewrite Executive Summary (value-led, concrete, honest status)
- lead with the problem; benefit-framed capabilities ('Gesamtüberblick statt
  Tabellenpflege', 'Freigaben in Sekunden'); clear delivered-value statement
- keep 65-PT effort table; sharper 'Nächster Schritt'
- regenerate PDF (25 p.) + DOCX

Co-Authored-By: Claude Opus 4.8 (1M context) <noreply@anthropic.com>
</commit_message>
<xml_diff>
--- a/docs/LASTENHEFT.docx
+++ b/docs/LASTENHEFT.docx
@@ -396,21 +396,31 @@
           <w:rFonts w:ascii="Helvetica" w:hAnsi="Helvetica" w:cs="Helvetica"/>
           <w:sz w:val="29"/>
           <w:sz-cs w:val="29"/>
-          <w:b/>
-          <w:spacing w:val="0"/>
-          <w:color w:val="131226"/>
-        </w:rPr>
-        <w:t xml:space="preserve">Ausgangslage &amp; Auftrag.</w:t>
-      </w:r>
-      <w:r>
-        <w:rPr>
-          <w:rFonts w:ascii="Helvetica" w:hAnsi="Helvetica" w:cs="Helvetica"/>
-          <w:sz w:val="29"/>
-          <w:sz-cs w:val="29"/>
-          <w:spacing w:val="0"/>
-          <w:color w:val="131226"/>
-        </w:rPr>
-        <w:t xml:space="preserve"> Die Software-Freigabe der BMW-Hochvoltspeicher (HVS) in der Abteilung ES-6 wird heute in einer manuell gepflegten Excel-Datei verfolgt — nicht mehrbenutzerfähig, fehleranfällig und von den Quellsystemen (IP3/CDH, Stücklisten, DEEP, WMM, Jira, MIA) entkoppelt. P3 Group wurde beauftragt, diese durch die Anwendung </w:t>
+          <w:spacing w:val="0"/>
+          <w:color w:val="131226"/>
+        </w:rPr>
+        <w:t xml:space="preserve">Die Freigabe der </w:t>
+      </w:r>
+      <w:r>
+        <w:rPr>
+          <w:rFonts w:ascii="Helvetica" w:hAnsi="Helvetica" w:cs="Helvetica"/>
+          <w:sz w:val="29"/>
+          <w:sz-cs w:val="29"/>
+          <w:b/>
+          <w:spacing w:val="0"/>
+          <w:color w:val="131226"/>
+        </w:rPr>
+        <w:t xml:space="preserve">Hochvoltspeicher-Software (HVS)</w:t>
+      </w:r>
+      <w:r>
+        <w:rPr>
+          <w:rFonts w:ascii="Helvetica" w:hAnsi="Helvetica" w:cs="Helvetica"/>
+          <w:sz w:val="29"/>
+          <w:sz-cs w:val="29"/>
+          <w:spacing w:val="0"/>
+          <w:color w:val="131226"/>
+        </w:rPr>
+        <w:t xml:space="preserve"> in der BMW-Abteilung ES-6 läuft heute über eine manuell gepflegte Excel-Datei: einzelplatzgebunden, fehleranfällig und ohne Verbindung zu den Systemen, in denen die maßgeblichen Termine, Stücklisten und Freigaben tatsächlich entstehen. P3 Group wurde beauftragt, diesen Prozess durch die Anwendung </w:t>
       </w:r>
       <w:r>
         <w:rPr>
@@ -431,7 +441,7 @@
           <w:spacing w:val="0"/>
           <w:color w:val="131226"/>
         </w:rPr>
-        <w:t xml:space="preserve"> zu ersetzen: eine zentrale, in Microsoft Dataverse verankerte App, die Daten automatisiert aus den Quellsystemen bezieht, die Freigabetermine im User-Interface bestätigen lässt und anschließend die nachgelagerten Zielsysteme befüllt.</w:t>
+        <w:t xml:space="preserve"> abzulösen und schrittweise zu automatisieren.</w:t>
       </w:r>
     </w:p>
     <w:p>
@@ -447,17 +457,17 @@
           <w:spacing w:val="0"/>
           <w:color w:val="131226"/>
         </w:rPr>
-        <w:t xml:space="preserve">Was P3 Group geliefert hat.</w:t>
-      </w:r>
-      <w:r>
-        <w:rPr>
-          <w:rFonts w:ascii="Helvetica" w:hAnsi="Helvetica" w:cs="Helvetica"/>
-          <w:sz w:val="29"/>
-          <w:sz-cs w:val="29"/>
-          <w:spacing w:val="0"/>
-          <w:color w:val="131226"/>
-        </w:rPr>
-        <w:t xml:space="preserve"> Im bisherigen Leistungsumfang von </w:t>
+        <w:t xml:space="preserve">Das Ergebnis auf den Punkt:</w:t>
+      </w:r>
+      <w:r>
+        <w:rPr>
+          <w:rFonts w:ascii="Helvetica" w:hAnsi="Helvetica" w:cs="Helvetica"/>
+          <w:sz w:val="29"/>
+          <w:sz-cs w:val="29"/>
+          <w:spacing w:val="0"/>
+          <w:color w:val="131226"/>
+        </w:rPr>
+        <w:t xml:space="preserve"> In </w:t>
       </w:r>
       <w:r>
         <w:rPr>
@@ -478,7 +488,117 @@
           <w:spacing w:val="0"/>
           <w:color w:val="131226"/>
         </w:rPr>
-        <w:t xml:space="preserve"> wurden erbracht:</w:t>
+        <w:t xml:space="preserve"> liegt ein </w:t>
+      </w:r>
+      <w:r>
+        <w:rPr>
+          <w:rFonts w:ascii="Helvetica" w:hAnsi="Helvetica" w:cs="Helvetica"/>
+          <w:sz w:val="29"/>
+          <w:sz-cs w:val="29"/>
+          <w:b/>
+          <w:spacing w:val="0"/>
+          <w:color w:val="131226"/>
+        </w:rPr>
+        <w:t xml:space="preserve">lauffähiger, mehrbenutzerfähiger Prototyp</w:t>
+      </w:r>
+      <w:r>
+        <w:rPr>
+          <w:rFonts w:ascii="Helvetica" w:hAnsi="Helvetica" w:cs="Helvetica"/>
+          <w:sz w:val="29"/>
+          <w:sz-cs w:val="29"/>
+          <w:spacing w:val="0"/>
+          <w:color w:val="131226"/>
+        </w:rPr>
+        <w:t xml:space="preserve"> auf Basis von Microsoft Power Apps und Dataverse vor, der den </w:t>
+      </w:r>
+      <w:r>
+        <w:rPr>
+          <w:rFonts w:ascii="Helvetica" w:hAnsi="Helvetica" w:cs="Helvetica"/>
+          <w:sz w:val="29"/>
+          <w:sz-cs w:val="29"/>
+          <w:b/>
+          <w:spacing w:val="0"/>
+          <w:color w:val="131226"/>
+        </w:rPr>
+        <w:t xml:space="preserve">kompletten internen Planungs- und Freigabeprozess</w:t>
+      </w:r>
+      <w:r>
+        <w:rPr>
+          <w:rFonts w:ascii="Helvetica" w:hAnsi="Helvetica" w:cs="Helvetica"/>
+          <w:sz w:val="29"/>
+          <w:sz-cs w:val="29"/>
+          <w:spacing w:val="0"/>
+          <w:color w:val="131226"/>
+        </w:rPr>
+        <w:t xml:space="preserve"> abbildet — flankiert von einer </w:t>
+      </w:r>
+      <w:r>
+        <w:rPr>
+          <w:rFonts w:ascii="Helvetica" w:hAnsi="Helvetica" w:cs="Helvetica"/>
+          <w:sz w:val="29"/>
+          <w:sz-cs w:val="29"/>
+          <w:b/>
+          <w:spacing w:val="0"/>
+          <w:color w:val="131226"/>
+        </w:rPr>
+        <w:t xml:space="preserve">vollständigen fachlichen Spezifikation und Architektur</w:t>
+      </w:r>
+      <w:r>
+        <w:rPr>
+          <w:rFonts w:ascii="Helvetica" w:hAnsi="Helvetica" w:cs="Helvetica"/>
+          <w:sz w:val="29"/>
+          <w:sz-cs w:val="29"/>
+          <w:spacing w:val="0"/>
+          <w:color w:val="131226"/>
+        </w:rPr>
+        <w:t xml:space="preserve">, mit der die Lösung in den Folgephasen durchgängig automatisiert wird. ES-6 verfügt damit heute über ein vorzeigbares Werkzeug </w:t>
+      </w:r>
+      <w:r>
+        <w:rPr>
+          <w:rFonts w:ascii="Helvetica" w:hAnsi="Helvetica" w:cs="Helvetica"/>
+          <w:sz w:val="29"/>
+          <w:sz-cs w:val="29"/>
+          <w:b/>
+          <w:spacing w:val="0"/>
+          <w:color w:val="131226"/>
+        </w:rPr>
+        <w:t xml:space="preserve">und</w:t>
+      </w:r>
+      <w:r>
+        <w:rPr>
+          <w:rFonts w:ascii="Helvetica" w:hAnsi="Helvetica" w:cs="Helvetica"/>
+          <w:sz w:val="29"/>
+          <w:sz-cs w:val="29"/>
+          <w:spacing w:val="0"/>
+          <w:color w:val="131226"/>
+        </w:rPr>
+        <w:t xml:space="preserve"> einen belastbaren Bauplan für den Weg zum Produktivsystem.</w:t>
+      </w:r>
+    </w:p>
+    <w:p>
+      <w:pPr>
+        <w:spacing w:after="293"/>
+      </w:pPr>
+      <w:r>
+        <w:rPr>
+          <w:rFonts w:ascii="Helvetica" w:hAnsi="Helvetica" w:cs="Helvetica"/>
+          <w:sz w:val="29"/>
+          <w:sz-cs w:val="29"/>
+          <w:b/>
+          <w:spacing w:val="0"/>
+          <w:color w:val="131226"/>
+        </w:rPr>
+        <w:t xml:space="preserve">Was die Anwendung heute leistet — anstelle der manuellen Excel-Pflege:</w:t>
+      </w:r>
+      <w:r>
+        <w:rPr>
+          <w:rFonts w:ascii="Helvetica" w:hAnsi="Helvetica" w:cs="Helvetica"/>
+          <w:sz w:val="29"/>
+          <w:sz-cs w:val="29"/>
+          <w:spacing w:val="0"/>
+          <w:color w:val="131226"/>
+        </w:rPr>
+        <w:t xml:space="preserve"/>
       </w:r>
     </w:p>
     <w:p>
@@ -508,17 +628,17 @@
           <w:spacing w:val="0"/>
           <w:color w:val="131226"/>
         </w:rPr>
-        <w:t xml:space="preserve">Vollständige Anforderungsaufnahme &amp; Spezifikation</w:t>
-      </w:r>
-      <w:r>
-        <w:rPr>
-          <w:rFonts w:ascii="Helvetica" w:hAnsi="Helvetica" w:cs="Helvetica"/>
-          <w:sz w:val="29"/>
-          <w:sz-cs w:val="29"/>
-          <w:spacing w:val="0"/>
-          <w:color w:val="131226"/>
-        </w:rPr>
-        <w:t xml:space="preserve"> — das vorliegende Lastenheft mit Datenmodell, Quell-/Zielsystem-Landschaft, vollständigem Kundenanforderungskatalog inkl. Umsetzungsbewertung und dem Epic-/Feature-Backlog (E0–E7).</w:t>
+        <w:t xml:space="preserve">Gesamtüberblick statt Tabellenpflege:</w:t>
+      </w:r>
+      <w:r>
+        <w:rPr>
+          <w:rFonts w:ascii="Helvetica" w:hAnsi="Helvetica" w:cs="Helvetica"/>
+          <w:sz w:val="29"/>
+          <w:sz-cs w:val="29"/>
+          <w:spacing w:val="0"/>
+          <w:color w:val="131226"/>
+        </w:rPr>
+        <w:t xml:space="preserve"> alle Hochvoltspeicher über die Kalenderwochen hinweg in einem Raster, mit farblicher I-Stufen-Logik und komplexer Live-Filterung nach I-Stufen, Wochen, Speichern und Penthouse.</w:t>
       </w:r>
     </w:p>
     <w:p>
@@ -548,101 +668,17 @@
           <w:spacing w:val="0"/>
           <w:color w:val="131226"/>
         </w:rPr>
-        <w:t xml:space="preserve">Lauffähiger App-Prototyp</w:t>
-      </w:r>
-      <w:r>
-        <w:rPr>
-          <w:rFonts w:ascii="Helvetica" w:hAnsi="Helvetica" w:cs="Helvetica"/>
-          <w:sz w:val="29"/>
-          <w:sz-cs w:val="29"/>
-          <w:spacing w:val="0"/>
-          <w:color w:val="131226"/>
-        </w:rPr>
-        <w:t xml:space="preserve"> (Power Apps Code App auf Microsoft Dataverse) mit vier Arbeitsbereichen: aktionsorientiertes </w:t>
-      </w:r>
-      <w:r>
-        <w:rPr>
-          <w:rFonts w:ascii="Helvetica" w:hAnsi="Helvetica" w:cs="Helvetica"/>
-          <w:sz w:val="29"/>
-          <w:sz-cs w:val="29"/>
-          <w:b/>
-          <w:spacing w:val="0"/>
-          <w:color w:val="131226"/>
-        </w:rPr>
-        <w:t xml:space="preserve">Cockpit</w:t>
-      </w:r>
-      <w:r>
-        <w:rPr>
-          <w:rFonts w:ascii="Helvetica" w:hAnsi="Helvetica" w:cs="Helvetica"/>
-          <w:sz w:val="29"/>
-          <w:sz-cs w:val="29"/>
-          <w:spacing w:val="0"/>
-          <w:color w:val="131226"/>
-        </w:rPr>
-        <w:t xml:space="preserve">, </w:t>
-      </w:r>
-      <w:r>
-        <w:rPr>
-          <w:rFonts w:ascii="Helvetica" w:hAnsi="Helvetica" w:cs="Helvetica"/>
-          <w:sz w:val="29"/>
-          <w:sz-cs w:val="29"/>
-          <w:b/>
-          <w:spacing w:val="0"/>
-          <w:color w:val="131226"/>
-        </w:rPr>
-        <w:t xml:space="preserve">Freigabe-Timeline</w:t>
-      </w:r>
-      <w:r>
-        <w:rPr>
-          <w:rFonts w:ascii="Helvetica" w:hAnsi="Helvetica" w:cs="Helvetica"/>
-          <w:sz w:val="29"/>
-          <w:sz-cs w:val="29"/>
-          <w:spacing w:val="0"/>
-          <w:color w:val="131226"/>
-        </w:rPr>
-        <w:t xml:space="preserve"> (Gantt-Übersicht), </w:t>
-      </w:r>
-      <w:r>
-        <w:rPr>
-          <w:rFonts w:ascii="Helvetica" w:hAnsi="Helvetica" w:cs="Helvetica"/>
-          <w:sz w:val="29"/>
-          <w:sz-cs w:val="29"/>
-          <w:b/>
-          <w:spacing w:val="0"/>
-          <w:color w:val="131226"/>
-        </w:rPr>
-        <w:t xml:space="preserve">Verschränkungen</w:t>
-      </w:r>
-      <w:r>
-        <w:rPr>
-          <w:rFonts w:ascii="Helvetica" w:hAnsi="Helvetica" w:cs="Helvetica"/>
-          <w:sz w:val="29"/>
-          <w:sz-cs w:val="29"/>
-          <w:spacing w:val="0"/>
-          <w:color w:val="131226"/>
-        </w:rPr>
-        <w:t xml:space="preserve"> und </w:t>
-      </w:r>
-      <w:r>
-        <w:rPr>
-          <w:rFonts w:ascii="Helvetica" w:hAnsi="Helvetica" w:cs="Helvetica"/>
-          <w:sz w:val="29"/>
-          <w:sz-cs w:val="29"/>
-          <w:b/>
-          <w:spacing w:val="0"/>
-          <w:color w:val="131226"/>
-        </w:rPr>
-        <w:t xml:space="preserve">Dataverse-Verwaltung</w:t>
-      </w:r>
-      <w:r>
-        <w:rPr>
-          <w:rFonts w:ascii="Helvetica" w:hAnsi="Helvetica" w:cs="Helvetica"/>
-          <w:sz w:val="29"/>
-          <w:sz-cs w:val="29"/>
-          <w:spacing w:val="0"/>
-          <w:color w:val="131226"/>
-        </w:rPr>
-        <w:t xml:space="preserve">.</w:t>
+        <w:t xml:space="preserve">Freigaben in Sekunden statt Zelle für Zelle:</w:t>
+      </w:r>
+      <w:r>
+        <w:rPr>
+          <w:rFonts w:ascii="Helvetica" w:hAnsi="Helvetica" w:cs="Helvetica"/>
+          <w:sz w:val="29"/>
+          <w:sz-cs w:val="29"/>
+          <w:spacing w:val="0"/>
+          <w:color w:val="131226"/>
+        </w:rPr>
+        <w:t xml:space="preserve"> Massen-Freigabe (Batch-Change) über viele Speicher und Wochen mit Verschränkungs- und Kaskadenlogik, dazu Terminverschiebung per Klick und durchgängige Soll-/Ist-Verfolgung.</w:t>
       </w:r>
     </w:p>
     <w:p>
@@ -672,17 +708,38 @@
           <w:spacing w:val="0"/>
           <w:color w:val="131226"/>
         </w:rPr>
-        <w:t xml:space="preserve">Automatisierte Datenpipeline „FGC_DATA"</w:t>
-      </w:r>
-      <w:r>
-        <w:rPr>
-          <w:rFonts w:ascii="Helvetica" w:hAnsi="Helvetica" w:cs="Helvetica"/>
-          <w:sz w:val="29"/>
-          <w:sz-cs w:val="29"/>
-          <w:spacing w:val="0"/>
-          <w:color w:val="131226"/>
-        </w:rPr>
-        <w:t xml:space="preserve"> — ETL der Quelldaten (IP3, Stücklisten, DEEP) nach Dataverse, inklusive Kalenderwochen- und I-Stufen-Logik.</w:t>
+        <w:t xml:space="preserve">Automatische Datenversorgung:</w:t>
+      </w:r>
+      <w:r>
+        <w:rPr>
+          <w:rFonts w:ascii="Helvetica" w:hAnsi="Helvetica" w:cs="Helvetica"/>
+          <w:sz w:val="29"/>
+          <w:sz-cs w:val="29"/>
+          <w:spacing w:val="0"/>
+          <w:color w:val="131226"/>
+        </w:rPr>
+        <w:t xml:space="preserve"> die Datenstrecke </w:t>
+      </w:r>
+      <w:r>
+        <w:rPr>
+          <w:rFonts w:ascii="Helvetica" w:hAnsi="Helvetica" w:cs="Helvetica"/>
+          <w:sz w:val="29"/>
+          <w:sz-cs w:val="29"/>
+          <w:b/>
+          <w:spacing w:val="0"/>
+          <w:color w:val="131226"/>
+        </w:rPr>
+        <w:t xml:space="preserve">„FGC_DATA"</w:t>
+      </w:r>
+      <w:r>
+        <w:rPr>
+          <w:rFonts w:ascii="Helvetica" w:hAnsi="Helvetica" w:cs="Helvetica"/>
+          <w:sz w:val="29"/>
+          <w:sz-cs w:val="29"/>
+          <w:spacing w:val="0"/>
+          <w:color w:val="131226"/>
+        </w:rPr>
+        <w:t xml:space="preserve"> überführt die Planungsdaten aus IP3, Stücklisten und DEEP automatisiert nach Dataverse — ohne manuelles Übertragen.</w:t>
       </w:r>
     </w:p>
     <w:p>
@@ -712,57 +769,17 @@
           <w:spacing w:val="0"/>
           <w:color w:val="131226"/>
         </w:rPr>
-        <w:t xml:space="preserve">Kern-Funktionalität der Freigabeplanung</w:t>
-      </w:r>
-      <w:r>
-        <w:rPr>
-          <w:rFonts w:ascii="Helvetica" w:hAnsi="Helvetica" w:cs="Helvetica"/>
-          <w:sz w:val="29"/>
-          <w:sz-cs w:val="29"/>
-          <w:spacing w:val="0"/>
-          <w:color w:val="131226"/>
-        </w:rPr>
-        <w:t xml:space="preserve">: Übersichtsgrid (HVS × Kalenderwoche), komplexe Live-Filterung, Batch-Change / Bulk-Freigabe, Terminverschiebung, Soll-/Ist-Verfolgung sowie die WMM-Prüf- und Delta-Logik.</w:t>
-      </w:r>
-    </w:p>
-    <w:p>
-      <w:pPr>
-        <w:ind w:left="720" w:first-line="-720"/>
-      </w:pPr>
-      <w:r>
-        <w:rPr>
-          <w:rFonts w:ascii="Helvetica" w:hAnsi="Helvetica" w:cs="Helvetica"/>
-          <w:sz w:val="29"/>
-          <w:sz-cs w:val="29"/>
-          <w:b/>
-          <w:color w:val="131226"/>
-        </w:rPr>
-        <w:t xml:space="preserve"/>
-        <w:tab/>
-        <w:t xml:space="preserve">•</w:t>
-        <w:tab/>
-        <w:t xml:space="preserve"/>
-      </w:r>
-      <w:r>
-        <w:rPr>
-          <w:rFonts w:ascii="Helvetica" w:hAnsi="Helvetica" w:cs="Helvetica"/>
-          <w:sz w:val="29"/>
-          <w:sz-cs w:val="29"/>
-          <w:b/>
-          <w:spacing w:val="0"/>
-          <w:color w:val="131226"/>
-        </w:rPr>
-        <w:t xml:space="preserve">Visuelle Architektur</w:t>
-      </w:r>
-      <w:r>
-        <w:rPr>
-          <w:rFonts w:ascii="Helvetica" w:hAnsi="Helvetica" w:cs="Helvetica"/>
-          <w:sz w:val="29"/>
-          <w:sz-cs w:val="29"/>
-          <w:spacing w:val="0"/>
-          <w:color w:val="131226"/>
-        </w:rPr>
-        <w:t xml:space="preserve">: Datenmodell als ER-Diagramm (Abb. 1) und End-to-End-Prozessskizze (Abb. 2).</w:t>
+        <w:t xml:space="preserve">Integrierte Qualitätssicherung:</w:t>
+      </w:r>
+      <w:r>
+        <w:rPr>
+          <w:rFonts w:ascii="Helvetica" w:hAnsi="Helvetica" w:cs="Helvetica"/>
+          <w:sz w:val="29"/>
+          <w:sz-cs w:val="29"/>
+          <w:spacing w:val="0"/>
+          <w:color w:val="131226"/>
+        </w:rPr>
+        <w:t xml:space="preserve"> WMM-Prüfung mit Delta-Erkennung (geänderte, neue und entfallene Sachnummern) direkt in der Oberfläche.</w:t>
       </w:r>
     </w:p>
     <w:p>
@@ -778,80 +795,59 @@
           <w:spacing w:val="0"/>
           <w:color w:val="131226"/>
         </w:rPr>
-        <w:t xml:space="preserve">Umsetzungsstand.</w:t>
-      </w:r>
-      <w:r>
-        <w:rPr>
-          <w:rFonts w:ascii="Helvetica" w:hAnsi="Helvetica" w:cs="Helvetica"/>
-          <w:sz w:val="29"/>
-          <w:sz-cs w:val="29"/>
-          <w:spacing w:val="0"/>
-          <w:color w:val="131226"/>
-        </w:rPr>
-        <w:t xml:space="preserve"> Der gesamte </w:t>
-      </w:r>
-      <w:r>
-        <w:rPr>
-          <w:rFonts w:ascii="Helvetica" w:hAnsi="Helvetica" w:cs="Helvetica"/>
-          <w:sz w:val="29"/>
-          <w:sz-cs w:val="29"/>
-          <w:b/>
-          <w:spacing w:val="0"/>
-          <w:color w:val="131226"/>
-        </w:rPr>
-        <w:t xml:space="preserve">interne Planungs- und Pflege-Kern</w:t>
-      </w:r>
-      <w:r>
-        <w:rPr>
-          <w:rFonts w:ascii="Helvetica" w:hAnsi="Helvetica" w:cs="Helvetica"/>
-          <w:sz w:val="29"/>
-          <w:sz-cs w:val="29"/>
-          <w:spacing w:val="0"/>
-          <w:color w:val="131226"/>
-        </w:rPr>
-        <w:t xml:space="preserve"> ist umgesetzt und demonstrierbar. Die Funktionen, die eine </w:t>
-      </w:r>
-      <w:r>
-        <w:rPr>
-          <w:rFonts w:ascii="Helvetica" w:hAnsi="Helvetica" w:cs="Helvetica"/>
-          <w:sz w:val="29"/>
-          <w:sz-cs w:val="29"/>
-          <w:b/>
-          <w:spacing w:val="0"/>
-          <w:color w:val="131226"/>
-        </w:rPr>
-        <w:t xml:space="preserve">produktive Live-Anbindung externer Systeme</w:t>
-      </w:r>
-      <w:r>
-        <w:rPr>
-          <w:rFonts w:ascii="Helvetica" w:hAnsi="Helvetica" w:cs="Helvetica"/>
-          <w:sz w:val="29"/>
-          <w:sz-cs w:val="29"/>
-          <w:spacing w:val="0"/>
-          <w:color w:val="131226"/>
-        </w:rPr>
-        <w:t xml:space="preserve"> voraussetzen — WMM/BATKAS·IHP, IP3-Polling, Jira-Ticketerzeugung und MIA-Anlagen — sind fachlich vollständig spezifiziert und im UI vorbereitet, ihre Aktivierung hängt jedoch an den noch herzustellenden Systemzugängen. Die offenen Punkte sind damit </w:t>
-      </w:r>
-      <w:r>
-        <w:rPr>
-          <w:rFonts w:ascii="Helvetica" w:hAnsi="Helvetica" w:cs="Helvetica"/>
-          <w:sz w:val="29"/>
-          <w:sz-cs w:val="29"/>
-          <w:b/>
-          <w:spacing w:val="0"/>
-          <w:color w:val="131226"/>
-        </w:rPr>
-        <w:t xml:space="preserve">nicht durch die Anwendung limitiert, sondern durch die externen Schnittstellen</w:t>
-      </w:r>
-      <w:r>
-        <w:rPr>
-          <w:rFonts w:ascii="Helvetica" w:hAnsi="Helvetica" w:cs="Helvetica"/>
-          <w:sz w:val="29"/>
-          <w:sz-cs w:val="29"/>
-          <w:spacing w:val="0"/>
-          <w:color w:val="131226"/>
-        </w:rPr>
-        <w:t xml:space="preserve"> (Details in §9 und §11).</w:t>
+        <w:t xml:space="preserve">Was darüber hinaus vollständig spezifiziert ist:</w:t>
+      </w:r>
+      <w:r>
+        <w:rPr>
+          <w:rFonts w:ascii="Helvetica" w:hAnsi="Helvetica" w:cs="Helvetica"/>
+          <w:sz w:val="29"/>
+          <w:sz-cs w:val="29"/>
+          <w:spacing w:val="0"/>
+          <w:color w:val="131226"/>
+        </w:rPr>
+        <w:t xml:space="preserve"> Dieses Lastenheft dokumentiert das gesamte Zielbild — Datenmodell (ER-Diagramm, Abb. 1), Quell-/Zielsystem-Landschaft (Prozessskizze, Abb. 2), den </w:t>
+      </w:r>
+      <w:r>
+        <w:rPr>
+          <w:rFonts w:ascii="Helvetica" w:hAnsi="Helvetica" w:cs="Helvetica"/>
+          <w:sz w:val="29"/>
+          <w:sz-cs w:val="29"/>
+          <w:b/>
+          <w:spacing w:val="0"/>
+          <w:color w:val="131226"/>
+        </w:rPr>
+        <w:t xml:space="preserve">bewerteten Kundenanforderungskatalog</w:t>
+      </w:r>
+      <w:r>
+        <w:rPr>
+          <w:rFonts w:ascii="Helvetica" w:hAnsi="Helvetica" w:cs="Helvetica"/>
+          <w:sz w:val="29"/>
+          <w:sz-cs w:val="29"/>
+          <w:spacing w:val="0"/>
+          <w:color w:val="131226"/>
+        </w:rPr>
+        <w:t xml:space="preserve"> sowie das </w:t>
+      </w:r>
+      <w:r>
+        <w:rPr>
+          <w:rFonts w:ascii="Helvetica" w:hAnsi="Helvetica" w:cs="Helvetica"/>
+          <w:sz w:val="29"/>
+          <w:sz-cs w:val="29"/>
+          <w:b/>
+          <w:spacing w:val="0"/>
+          <w:color w:val="131226"/>
+        </w:rPr>
+        <w:t xml:space="preserve">Epic-/Feature-Backlog (E0–E7)</w:t>
+      </w:r>
+      <w:r>
+        <w:rPr>
+          <w:rFonts w:ascii="Helvetica" w:hAnsi="Helvetica" w:cs="Helvetica"/>
+          <w:sz w:val="29"/>
+          <w:sz-cs w:val="29"/>
+          <w:spacing w:val="0"/>
+          <w:color w:val="131226"/>
+        </w:rPr>
+        <w:t xml:space="preserve">. Die Lösung ist damit nicht nur gebaut, sondern auch nachvollziehbar dokumentiert und planbar erweiterbar.</w:t>
       </w:r>
     </w:p>
     <w:p>
@@ -867,516 +863,80 @@
           <w:spacing w:val="0"/>
           <w:color w:val="131226"/>
         </w:rPr>
-        <w:t xml:space="preserve">Erbrachte Leistung nach Liefergegenständen.</w:t>
-      </w:r>
-      <w:r>
-        <w:rPr>
-          <w:rFonts w:ascii="Helvetica" w:hAnsi="Helvetica" w:cs="Helvetica"/>
-          <w:sz w:val="29"/>
-          <w:sz-cs w:val="29"/>
-          <w:spacing w:val="0"/>
-          <w:color w:val="131226"/>
-        </w:rPr>
-        <w:t xml:space="preserve"> Der Leistungsumfang verteilt sich auf </w:t>
-      </w:r>
-      <w:r>
-        <w:rPr>
-          <w:rFonts w:ascii="Helvetica" w:hAnsi="Helvetica" w:cs="Helvetica"/>
-          <w:sz w:val="29"/>
-          <w:sz-cs w:val="29"/>
-          <w:b/>
-          <w:spacing w:val="0"/>
-          <w:color w:val="131226"/>
-        </w:rPr>
-        <w:t xml:space="preserve">Requirements Engineering (31 Tage)</w:t>
-      </w:r>
-      <w:r>
-        <w:rPr>
-          <w:rFonts w:ascii="Helvetica" w:hAnsi="Helvetica" w:cs="Helvetica"/>
-          <w:sz w:val="29"/>
-          <w:sz-cs w:val="29"/>
-          <w:spacing w:val="0"/>
-          <w:color w:val="131226"/>
-        </w:rPr>
-        <w:t xml:space="preserve">, </w:t>
-      </w:r>
-      <w:r>
-        <w:rPr>
-          <w:rFonts w:ascii="Helvetica" w:hAnsi="Helvetica" w:cs="Helvetica"/>
-          <w:sz w:val="29"/>
-          <w:sz-cs w:val="29"/>
-          <w:b/>
-          <w:spacing w:val="0"/>
-          <w:color w:val="131226"/>
-        </w:rPr>
-        <w:t xml:space="preserve">Solution Architecture (32 Tage)</w:t>
-      </w:r>
-      <w:r>
-        <w:rPr>
-          <w:rFonts w:ascii="Helvetica" w:hAnsi="Helvetica" w:cs="Helvetica"/>
-          <w:sz w:val="29"/>
-          <w:sz-cs w:val="29"/>
-          <w:spacing w:val="0"/>
-          <w:color w:val="131226"/>
-        </w:rPr>
-        <w:t xml:space="preserve"> und einen gemeinsamen </w:t>
-      </w:r>
-      <w:r>
-        <w:rPr>
-          <w:rFonts w:ascii="Helvetica" w:hAnsi="Helvetica" w:cs="Helvetica"/>
-          <w:sz w:val="29"/>
-          <w:sz-cs w:val="29"/>
-          <w:b/>
-          <w:spacing w:val="0"/>
-          <w:color w:val="131226"/>
-        </w:rPr>
-        <w:t xml:space="preserve">Designworkshop (2 Tage)</w:t>
-      </w:r>
-      <w:r>
-        <w:rPr>
-          <w:rFonts w:ascii="Helvetica" w:hAnsi="Helvetica" w:cs="Helvetica"/>
-          <w:sz w:val="29"/>
-          <w:sz-cs w:val="29"/>
-          <w:spacing w:val="0"/>
-          <w:color w:val="131226"/>
-        </w:rPr>
-        <w:t xml:space="preserve"> — in Summe </w:t>
-      </w:r>
-      <w:r>
-        <w:rPr>
-          <w:rFonts w:ascii="Helvetica" w:hAnsi="Helvetica" w:cs="Helvetica"/>
-          <w:sz w:val="29"/>
-          <w:sz-cs w:val="29"/>
-          <w:b/>
-          <w:spacing w:val="0"/>
-          <w:color w:val="131226"/>
-        </w:rPr>
-        <w:t xml:space="preserve">65 Tage</w:t>
-      </w:r>
-      <w:r>
-        <w:rPr>
-          <w:rFonts w:ascii="Helvetica" w:hAnsi="Helvetica" w:cs="Helvetica"/>
-          <w:sz w:val="29"/>
-          <w:sz-cs w:val="29"/>
-          <w:spacing w:val="0"/>
-          <w:color w:val="131226"/>
-        </w:rPr>
-        <w:t xml:space="preserve">:</w:t>
-      </w:r>
-    </w:p>
-    <w:p>
-      <w:pPr/>
-      <w:r>
-        <w:rPr>
-          <w:rFonts w:ascii="Helvetica" w:hAnsi="Helvetica" w:cs="Helvetica"/>
-          <w:sz w:val="29"/>
-          <w:sz-cs w:val="29"/>
-          <w:b/>
-          <w:spacing w:val="0"/>
-          <w:color w:val="FFFFFF"/>
-        </w:rPr>
-        <w:t xml:space="preserve">Liefergegenstand</w:t>
-      </w:r>
-    </w:p>
-    <w:p>
-      <w:pPr/>
-      <w:r>
-        <w:rPr>
-          <w:rFonts w:ascii="Helvetica" w:hAnsi="Helvetica" w:cs="Helvetica"/>
-          <w:sz w:val="29"/>
-          <w:sz-cs w:val="29"/>
-          <w:b/>
-          <w:spacing w:val="0"/>
-          <w:color w:val="FFFFFF"/>
-        </w:rPr>
-        <w:t xml:space="preserve">Aufwand</w:t>
-      </w:r>
-    </w:p>
-    <w:p>
-      <w:pPr/>
-      <w:r>
-        <w:rPr>
-          <w:rFonts w:ascii="Helvetica" w:hAnsi="Helvetica" w:cs="Helvetica"/>
-          <w:sz w:val="29"/>
-          <w:sz-cs w:val="29"/>
-          <w:b/>
-          <w:spacing w:val="0"/>
-          <w:color w:val="FFFFFF"/>
-        </w:rPr>
-        <w:t xml:space="preserve">Rolle</w:t>
-      </w:r>
-    </w:p>
-    <w:p>
-      <w:pPr/>
-      <w:r>
-        <w:rPr>
-          <w:rFonts w:ascii="Helvetica" w:hAnsi="Helvetica" w:cs="Helvetica"/>
-          <w:sz w:val="29"/>
-          <w:sz-cs w:val="29"/>
-          <w:spacing w:val="0"/>
-          <w:color w:val="131226"/>
-        </w:rPr>
-        <w:t xml:space="preserve">Projektanalyse und -planung</w:t>
-      </w:r>
-    </w:p>
-    <w:p>
-      <w:pPr/>
-      <w:r>
-        <w:rPr>
-          <w:rFonts w:ascii="Helvetica" w:hAnsi="Helvetica" w:cs="Helvetica"/>
-          <w:sz w:val="29"/>
-          <w:sz-cs w:val="29"/>
-          <w:spacing w:val="0"/>
-          <w:color w:val="131226"/>
-        </w:rPr>
-        <w:t xml:space="preserve">5 Tage</w:t>
-      </w:r>
-    </w:p>
-    <w:p>
-      <w:pPr/>
-      <w:r>
-        <w:rPr>
-          <w:rFonts w:ascii="Helvetica" w:hAnsi="Helvetica" w:cs="Helvetica"/>
-          <w:sz w:val="29"/>
-          <w:sz-cs w:val="29"/>
-          <w:spacing w:val="0"/>
-          <w:color w:val="131226"/>
-        </w:rPr>
-        <w:t xml:space="preserve">Senior Requirement Engineer</w:t>
-      </w:r>
-    </w:p>
-    <w:p>
-      <w:pPr/>
-      <w:r>
-        <w:rPr>
-          <w:rFonts w:ascii="Helvetica" w:hAnsi="Helvetica" w:cs="Helvetica"/>
-          <w:sz w:val="29"/>
-          <w:sz-cs w:val="29"/>
-          <w:spacing w:val="0"/>
-          <w:color w:val="131226"/>
-        </w:rPr>
-        <w:t xml:space="preserve">Projektmanagement</w:t>
-      </w:r>
-    </w:p>
-    <w:p>
-      <w:pPr/>
-      <w:r>
-        <w:rPr>
-          <w:rFonts w:ascii="Helvetica" w:hAnsi="Helvetica" w:cs="Helvetica"/>
-          <w:sz w:val="29"/>
-          <w:sz-cs w:val="29"/>
-          <w:spacing w:val="0"/>
-          <w:color w:val="131226"/>
-        </w:rPr>
-        <w:t xml:space="preserve">2 Tage</w:t>
-      </w:r>
-    </w:p>
-    <w:p>
-      <w:pPr/>
-      <w:r>
-        <w:rPr>
-          <w:rFonts w:ascii="Helvetica" w:hAnsi="Helvetica" w:cs="Helvetica"/>
-          <w:sz w:val="29"/>
-          <w:sz-cs w:val="29"/>
-          <w:spacing w:val="0"/>
-          <w:color w:val="131226"/>
-        </w:rPr>
-        <w:t xml:space="preserve">Senior Requirement Engineer</w:t>
-      </w:r>
-    </w:p>
-    <w:p>
-      <w:pPr/>
-      <w:r>
-        <w:rPr>
-          <w:rFonts w:ascii="Helvetica" w:hAnsi="Helvetica" w:cs="Helvetica"/>
-          <w:sz w:val="29"/>
-          <w:sz-cs w:val="29"/>
-          <w:spacing w:val="0"/>
-          <w:color w:val="131226"/>
-        </w:rPr>
-        <w:t xml:space="preserve">Anforderungsaufnahme und Backlogmanagement</w:t>
-      </w:r>
-    </w:p>
-    <w:p>
-      <w:pPr/>
-      <w:r>
-        <w:rPr>
-          <w:rFonts w:ascii="Helvetica" w:hAnsi="Helvetica" w:cs="Helvetica"/>
-          <w:sz w:val="29"/>
-          <w:sz-cs w:val="29"/>
-          <w:spacing w:val="0"/>
-          <w:color w:val="131226"/>
-        </w:rPr>
-        <w:t xml:space="preserve">17 Tage</w:t>
-      </w:r>
-    </w:p>
-    <w:p>
-      <w:pPr/>
-      <w:r>
-        <w:rPr>
-          <w:rFonts w:ascii="Helvetica" w:hAnsi="Helvetica" w:cs="Helvetica"/>
-          <w:sz w:val="29"/>
-          <w:sz-cs w:val="29"/>
-          <w:spacing w:val="0"/>
-          <w:color w:val="131226"/>
-        </w:rPr>
-        <w:t xml:space="preserve">Senior Requirement Engineer</w:t>
-      </w:r>
-    </w:p>
-    <w:p>
-      <w:pPr/>
-      <w:r>
-        <w:rPr>
-          <w:rFonts w:ascii="Helvetica" w:hAnsi="Helvetica" w:cs="Helvetica"/>
-          <w:sz w:val="29"/>
-          <w:sz-cs w:val="29"/>
-          <w:spacing w:val="0"/>
-          <w:color w:val="131226"/>
-        </w:rPr>
-        <w:t xml:space="preserve">Schnittstellen- und Systemsondierungen</w:t>
-      </w:r>
-    </w:p>
-    <w:p>
-      <w:pPr/>
-      <w:r>
-        <w:rPr>
-          <w:rFonts w:ascii="Helvetica" w:hAnsi="Helvetica" w:cs="Helvetica"/>
-          <w:sz w:val="29"/>
-          <w:sz-cs w:val="29"/>
-          <w:spacing w:val="0"/>
-          <w:color w:val="131226"/>
-        </w:rPr>
-        <w:t xml:space="preserve">7 Tage</w:t>
-      </w:r>
-    </w:p>
-    <w:p>
-      <w:pPr/>
-      <w:r>
-        <w:rPr>
-          <w:rFonts w:ascii="Helvetica" w:hAnsi="Helvetica" w:cs="Helvetica"/>
-          <w:sz w:val="29"/>
-          <w:sz-cs w:val="29"/>
-          <w:spacing w:val="0"/>
-          <w:color w:val="131226"/>
-        </w:rPr>
-        <w:t xml:space="preserve">Senior Requirement Engineer</w:t>
-      </w:r>
-    </w:p>
-    <w:p>
-      <w:pPr/>
-      <w:r>
-        <w:rPr>
-          <w:rFonts w:ascii="Helvetica" w:hAnsi="Helvetica" w:cs="Helvetica"/>
-          <w:sz w:val="29"/>
-          <w:sz-cs w:val="29"/>
-          <w:spacing w:val="0"/>
-          <w:color w:val="131226"/>
-        </w:rPr>
-        <w:t xml:space="preserve">Mockup-Erstellung initiales Konzept</w:t>
-      </w:r>
-    </w:p>
-    <w:p>
-      <w:pPr/>
-      <w:r>
-        <w:rPr>
-          <w:rFonts w:ascii="Helvetica" w:hAnsi="Helvetica" w:cs="Helvetica"/>
-          <w:sz w:val="29"/>
-          <w:sz-cs w:val="29"/>
-          <w:spacing w:val="0"/>
-          <w:color w:val="131226"/>
-        </w:rPr>
-        <w:t xml:space="preserve">5 Tage</w:t>
-      </w:r>
-    </w:p>
-    <w:p>
-      <w:pPr/>
-      <w:r>
-        <w:rPr>
-          <w:rFonts w:ascii="Helvetica" w:hAnsi="Helvetica" w:cs="Helvetica"/>
-          <w:sz w:val="29"/>
-          <w:sz-cs w:val="29"/>
-          <w:spacing w:val="0"/>
-          <w:color w:val="131226"/>
-        </w:rPr>
-        <w:t xml:space="preserve">Senior Solution Architect</w:t>
-      </w:r>
-    </w:p>
-    <w:p>
-      <w:pPr/>
-      <w:r>
-        <w:rPr>
-          <w:rFonts w:ascii="Helvetica" w:hAnsi="Helvetica" w:cs="Helvetica"/>
-          <w:sz w:val="29"/>
-          <w:sz-cs w:val="29"/>
-          <w:spacing w:val="0"/>
-          <w:color w:val="131226"/>
-        </w:rPr>
-        <w:t xml:space="preserve">Data Engineering und Backend-Konfiguration</w:t>
-      </w:r>
-    </w:p>
-    <w:p>
-      <w:pPr/>
-      <w:r>
-        <w:rPr>
-          <w:rFonts w:ascii="Helvetica" w:hAnsi="Helvetica" w:cs="Helvetica"/>
-          <w:sz w:val="29"/>
-          <w:sz-cs w:val="29"/>
-          <w:spacing w:val="0"/>
-          <w:color w:val="131226"/>
-        </w:rPr>
-        <w:t xml:space="preserve">4 Tage</w:t>
-      </w:r>
-    </w:p>
-    <w:p>
-      <w:pPr/>
-      <w:r>
-        <w:rPr>
-          <w:rFonts w:ascii="Helvetica" w:hAnsi="Helvetica" w:cs="Helvetica"/>
-          <w:sz w:val="29"/>
-          <w:sz-cs w:val="29"/>
-          <w:spacing w:val="0"/>
-          <w:color w:val="131226"/>
-        </w:rPr>
-        <w:t xml:space="preserve">Senior Solution Architect</w:t>
-      </w:r>
-    </w:p>
-    <w:p>
-      <w:pPr/>
-      <w:r>
-        <w:rPr>
-          <w:rFonts w:ascii="Helvetica" w:hAnsi="Helvetica" w:cs="Helvetica"/>
-          <w:sz w:val="29"/>
-          <w:sz-cs w:val="29"/>
-          <w:spacing w:val="0"/>
-          <w:color w:val="131226"/>
-        </w:rPr>
-        <w:t xml:space="preserve">Frontend-Erstellung – iteratives Mockup-Konzept</w:t>
-      </w:r>
-    </w:p>
-    <w:p>
-      <w:pPr/>
-      <w:r>
-        <w:rPr>
-          <w:rFonts w:ascii="Helvetica" w:hAnsi="Helvetica" w:cs="Helvetica"/>
-          <w:sz w:val="29"/>
-          <w:sz-cs w:val="29"/>
-          <w:spacing w:val="0"/>
-          <w:color w:val="131226"/>
-        </w:rPr>
-        <w:t xml:space="preserve">23 Tage</w:t>
-      </w:r>
-    </w:p>
-    <w:p>
-      <w:pPr/>
-      <w:r>
-        <w:rPr>
-          <w:rFonts w:ascii="Helvetica" w:hAnsi="Helvetica" w:cs="Helvetica"/>
-          <w:sz w:val="29"/>
-          <w:sz-cs w:val="29"/>
-          <w:spacing w:val="0"/>
-          <w:color w:val="131226"/>
-        </w:rPr>
-        <w:t xml:space="preserve">Senior Solution Architect</w:t>
-      </w:r>
-    </w:p>
-    <w:p>
-      <w:pPr/>
-      <w:r>
-        <w:rPr>
-          <w:rFonts w:ascii="Helvetica" w:hAnsi="Helvetica" w:cs="Helvetica"/>
-          <w:sz w:val="29"/>
-          <w:sz-cs w:val="29"/>
-          <w:spacing w:val="0"/>
-          <w:color w:val="131226"/>
-        </w:rPr>
-        <w:t xml:space="preserve">Designworkshop</w:t>
-      </w:r>
-    </w:p>
-    <w:p>
-      <w:pPr/>
-      <w:r>
-        <w:rPr>
-          <w:rFonts w:ascii="Helvetica" w:hAnsi="Helvetica" w:cs="Helvetica"/>
-          <w:sz w:val="29"/>
-          <w:sz-cs w:val="29"/>
-          <w:spacing w:val="0"/>
-          <w:color w:val="131226"/>
-        </w:rPr>
-        <w:t xml:space="preserve">2 Tage</w:t>
-      </w:r>
-    </w:p>
-    <w:p>
-      <w:pPr/>
-      <w:r>
-        <w:rPr>
-          <w:rFonts w:ascii="Helvetica" w:hAnsi="Helvetica" w:cs="Helvetica"/>
-          <w:sz w:val="29"/>
-          <w:sz-cs w:val="29"/>
-          <w:spacing w:val="0"/>
-          <w:color w:val="131226"/>
-        </w:rPr>
-        <w:t xml:space="preserve">Senior Solution Architect / Senior Requirement Engineer</w:t>
-      </w:r>
-    </w:p>
-    <w:p>
-      <w:pPr/>
-      <w:r>
-        <w:rPr>
-          <w:rFonts w:ascii="Helvetica" w:hAnsi="Helvetica" w:cs="Helvetica"/>
-          <w:sz w:val="29"/>
-          <w:sz-cs w:val="29"/>
-          <w:b/>
-          <w:spacing w:val="0"/>
-          <w:color w:val="131226"/>
-        </w:rPr>
-        <w:t xml:space="preserve">Gesamtaufwendungen</w:t>
-      </w:r>
-      <w:r>
-        <w:rPr>
-          <w:rFonts w:ascii="Helvetica" w:hAnsi="Helvetica" w:cs="Helvetica"/>
-          <w:sz w:val="29"/>
-          <w:sz-cs w:val="29"/>
-          <w:spacing w:val="0"/>
-          <w:color w:val="131226"/>
-        </w:rPr>
-        <w:t xml:space="preserve"/>
-      </w:r>
-    </w:p>
-    <w:p>
-      <w:pPr/>
-      <w:r>
-        <w:rPr>
-          <w:rFonts w:ascii="Helvetica" w:hAnsi="Helvetica" w:cs="Helvetica"/>
-          <w:sz w:val="29"/>
-          <w:sz-cs w:val="29"/>
-          <w:b/>
-          <w:spacing w:val="0"/>
-          <w:color w:val="131226"/>
-        </w:rPr>
-        <w:t xml:space="preserve">65 Tage</w:t>
-      </w:r>
-      <w:r>
-        <w:rPr>
-          <w:rFonts w:ascii="Helvetica" w:hAnsi="Helvetica" w:cs="Helvetica"/>
-          <w:sz w:val="29"/>
-          <w:sz-cs w:val="29"/>
-          <w:spacing w:val="0"/>
-          <w:color w:val="131226"/>
-        </w:rPr>
-        <w:t xml:space="preserve"/>
-      </w:r>
-    </w:p>
-    <w:p>
-      <w:pPr/>
-      <w:r>
-        <w:rPr>
-          <w:rFonts w:ascii="Helvetica" w:hAnsi="Helvetica" w:cs="Helvetica"/>
-          <w:sz w:val="29"/>
-          <w:sz-cs w:val="29"/>
-          <w:spacing w:val="0"/>
-          <w:color w:val="131226"/>
-        </w:rPr>
-        <w:t xml:space="preserve"/>
+        <w:t xml:space="preserve">Umsetzungsstand — klar und ehrlich:</w:t>
+      </w:r>
+      <w:r>
+        <w:rPr>
+          <w:rFonts w:ascii="Helvetica" w:hAnsi="Helvetica" w:cs="Helvetica"/>
+          <w:sz w:val="29"/>
+          <w:sz-cs w:val="29"/>
+          <w:spacing w:val="0"/>
+          <w:color w:val="131226"/>
+        </w:rPr>
+        <w:t xml:space="preserve"> Der interne Planungs- und Freigabekern ist </w:t>
+      </w:r>
+      <w:r>
+        <w:rPr>
+          <w:rFonts w:ascii="Helvetica" w:hAnsi="Helvetica" w:cs="Helvetica"/>
+          <w:sz w:val="29"/>
+          <w:sz-cs w:val="29"/>
+          <w:b/>
+          <w:spacing w:val="0"/>
+          <w:color w:val="131226"/>
+        </w:rPr>
+        <w:t xml:space="preserve">umgesetzt und demonstrierbar</w:t>
+      </w:r>
+      <w:r>
+        <w:rPr>
+          <w:rFonts w:ascii="Helvetica" w:hAnsi="Helvetica" w:cs="Helvetica"/>
+          <w:sz w:val="29"/>
+          <w:sz-cs w:val="29"/>
+          <w:spacing w:val="0"/>
+          <w:color w:val="131226"/>
+        </w:rPr>
+        <w:t xml:space="preserve">. Alle Funktionen, die einen </w:t>
+      </w:r>
+      <w:r>
+        <w:rPr>
+          <w:rFonts w:ascii="Helvetica" w:hAnsi="Helvetica" w:cs="Helvetica"/>
+          <w:sz w:val="29"/>
+          <w:sz-cs w:val="29"/>
+          <w:b/>
+          <w:spacing w:val="0"/>
+          <w:color w:val="131226"/>
+        </w:rPr>
+        <w:t xml:space="preserve">produktiven Live-Zugriff auf externe BMW-Systeme</w:t>
+      </w:r>
+      <w:r>
+        <w:rPr>
+          <w:rFonts w:ascii="Helvetica" w:hAnsi="Helvetica" w:cs="Helvetica"/>
+          <w:sz w:val="29"/>
+          <w:sz-cs w:val="29"/>
+          <w:spacing w:val="0"/>
+          <w:color w:val="131226"/>
+        </w:rPr>
+        <w:t xml:space="preserve"> voraussetzen (WMM/BATKAS·IHP, IP3, Jira CodeCraft, MIA), sind fachlich spezifiziert und in der Oberfläche vorbereitet; ihre Aktivierung hängt allein an der Bereitstellung der jeweiligen Schnittstellen. </w:t>
+      </w:r>
+      <w:r>
+        <w:rPr>
+          <w:rFonts w:ascii="Helvetica" w:hAnsi="Helvetica" w:cs="Helvetica"/>
+          <w:sz w:val="29"/>
+          <w:sz-cs w:val="29"/>
+          <w:b/>
+          <w:spacing w:val="0"/>
+          <w:color w:val="131226"/>
+        </w:rPr>
+        <w:t xml:space="preserve">Der offene Umfang ist damit nicht durch die Anwendung bedingt, sondern durch die externen Systemzugänge</w:t>
+      </w:r>
+      <w:r>
+        <w:rPr>
+          <w:rFonts w:ascii="Helvetica" w:hAnsi="Helvetica" w:cs="Helvetica"/>
+          <w:sz w:val="29"/>
+          <w:sz-cs w:val="29"/>
+          <w:spacing w:val="0"/>
+          <w:color w:val="131226"/>
+        </w:rPr>
+        <w:t xml:space="preserve"> (Details in §9 und §11).</w:t>
       </w:r>
     </w:p>
     <w:p>
@@ -1392,17 +952,479 @@
           <w:spacing w:val="0"/>
           <w:color w:val="131226"/>
         </w:rPr>
-        <w:t xml:space="preserve">Ausblick.</w:t>
-      </w:r>
-      <w:r>
-        <w:rPr>
-          <w:rFonts w:ascii="Helvetica" w:hAnsi="Helvetica" w:cs="Helvetica"/>
-          <w:sz w:val="29"/>
-          <w:sz-cs w:val="29"/>
-          <w:spacing w:val="0"/>
-          <w:color w:val="131226"/>
-        </w:rPr>
-        <w:t xml:space="preserve"> Mit der abgestimmten Spezifikation und dem lauffähigen Prototyp ist die Grundlage gelegt, um in der Folgephase die externen Schnittstellen (CDH, Jira, MIA, WMM) anzubinden und die Automatisierung durchgängig (end-to-end) zu produktivieren.</w:t>
+        <w:t xml:space="preserve">Erbrachte Leistung nach Liefergegenständen</w:t>
+      </w:r>
+      <w:r>
+        <w:rPr>
+          <w:rFonts w:ascii="Helvetica" w:hAnsi="Helvetica" w:cs="Helvetica"/>
+          <w:sz w:val="29"/>
+          <w:sz-cs w:val="29"/>
+          <w:spacing w:val="0"/>
+          <w:color w:val="131226"/>
+        </w:rPr>
+        <w:t xml:space="preserve"> — verteilt auf Requirements Engineering (31 Tage), Solution Architecture (32 Tage) und einen gemeinsamen Designworkshop (2 Tage), in Summe </w:t>
+      </w:r>
+      <w:r>
+        <w:rPr>
+          <w:rFonts w:ascii="Helvetica" w:hAnsi="Helvetica" w:cs="Helvetica"/>
+          <w:sz w:val="29"/>
+          <w:sz-cs w:val="29"/>
+          <w:b/>
+          <w:spacing w:val="0"/>
+          <w:color w:val="131226"/>
+        </w:rPr>
+        <w:t xml:space="preserve">65 Tage</w:t>
+      </w:r>
+      <w:r>
+        <w:rPr>
+          <w:rFonts w:ascii="Helvetica" w:hAnsi="Helvetica" w:cs="Helvetica"/>
+          <w:sz w:val="29"/>
+          <w:sz-cs w:val="29"/>
+          <w:spacing w:val="0"/>
+          <w:color w:val="131226"/>
+        </w:rPr>
+        <w:t xml:space="preserve">:</w:t>
+      </w:r>
+    </w:p>
+    <w:p>
+      <w:pPr/>
+      <w:r>
+        <w:rPr>
+          <w:rFonts w:ascii="Helvetica" w:hAnsi="Helvetica" w:cs="Helvetica"/>
+          <w:sz w:val="29"/>
+          <w:sz-cs w:val="29"/>
+          <w:b/>
+          <w:spacing w:val="0"/>
+          <w:color w:val="FFFFFF"/>
+        </w:rPr>
+        <w:t xml:space="preserve">Liefergegenstand</w:t>
+      </w:r>
+    </w:p>
+    <w:p>
+      <w:pPr/>
+      <w:r>
+        <w:rPr>
+          <w:rFonts w:ascii="Helvetica" w:hAnsi="Helvetica" w:cs="Helvetica"/>
+          <w:sz w:val="29"/>
+          <w:sz-cs w:val="29"/>
+          <w:b/>
+          <w:spacing w:val="0"/>
+          <w:color w:val="FFFFFF"/>
+        </w:rPr>
+        <w:t xml:space="preserve">Aufwand</w:t>
+      </w:r>
+    </w:p>
+    <w:p>
+      <w:pPr/>
+      <w:r>
+        <w:rPr>
+          <w:rFonts w:ascii="Helvetica" w:hAnsi="Helvetica" w:cs="Helvetica"/>
+          <w:sz w:val="29"/>
+          <w:sz-cs w:val="29"/>
+          <w:b/>
+          <w:spacing w:val="0"/>
+          <w:color w:val="FFFFFF"/>
+        </w:rPr>
+        <w:t xml:space="preserve">Rolle</w:t>
+      </w:r>
+    </w:p>
+    <w:p>
+      <w:pPr/>
+      <w:r>
+        <w:rPr>
+          <w:rFonts w:ascii="Helvetica" w:hAnsi="Helvetica" w:cs="Helvetica"/>
+          <w:sz w:val="29"/>
+          <w:sz-cs w:val="29"/>
+          <w:spacing w:val="0"/>
+          <w:color w:val="131226"/>
+        </w:rPr>
+        <w:t xml:space="preserve">Projektanalyse und -planung</w:t>
+      </w:r>
+    </w:p>
+    <w:p>
+      <w:pPr/>
+      <w:r>
+        <w:rPr>
+          <w:rFonts w:ascii="Helvetica" w:hAnsi="Helvetica" w:cs="Helvetica"/>
+          <w:sz w:val="29"/>
+          <w:sz-cs w:val="29"/>
+          <w:spacing w:val="0"/>
+          <w:color w:val="131226"/>
+        </w:rPr>
+        <w:t xml:space="preserve">5 Tage</w:t>
+      </w:r>
+    </w:p>
+    <w:p>
+      <w:pPr/>
+      <w:r>
+        <w:rPr>
+          <w:rFonts w:ascii="Helvetica" w:hAnsi="Helvetica" w:cs="Helvetica"/>
+          <w:sz w:val="29"/>
+          <w:sz-cs w:val="29"/>
+          <w:spacing w:val="0"/>
+          <w:color w:val="131226"/>
+        </w:rPr>
+        <w:t xml:space="preserve">Senior Requirement Engineer</w:t>
+      </w:r>
+    </w:p>
+    <w:p>
+      <w:pPr/>
+      <w:r>
+        <w:rPr>
+          <w:rFonts w:ascii="Helvetica" w:hAnsi="Helvetica" w:cs="Helvetica"/>
+          <w:sz w:val="29"/>
+          <w:sz-cs w:val="29"/>
+          <w:spacing w:val="0"/>
+          <w:color w:val="131226"/>
+        </w:rPr>
+        <w:t xml:space="preserve">Projektmanagement</w:t>
+      </w:r>
+    </w:p>
+    <w:p>
+      <w:pPr/>
+      <w:r>
+        <w:rPr>
+          <w:rFonts w:ascii="Helvetica" w:hAnsi="Helvetica" w:cs="Helvetica"/>
+          <w:sz w:val="29"/>
+          <w:sz-cs w:val="29"/>
+          <w:spacing w:val="0"/>
+          <w:color w:val="131226"/>
+        </w:rPr>
+        <w:t xml:space="preserve">2 Tage</w:t>
+      </w:r>
+    </w:p>
+    <w:p>
+      <w:pPr/>
+      <w:r>
+        <w:rPr>
+          <w:rFonts w:ascii="Helvetica" w:hAnsi="Helvetica" w:cs="Helvetica"/>
+          <w:sz w:val="29"/>
+          <w:sz-cs w:val="29"/>
+          <w:spacing w:val="0"/>
+          <w:color w:val="131226"/>
+        </w:rPr>
+        <w:t xml:space="preserve">Senior Requirement Engineer</w:t>
+      </w:r>
+    </w:p>
+    <w:p>
+      <w:pPr/>
+      <w:r>
+        <w:rPr>
+          <w:rFonts w:ascii="Helvetica" w:hAnsi="Helvetica" w:cs="Helvetica"/>
+          <w:sz w:val="29"/>
+          <w:sz-cs w:val="29"/>
+          <w:spacing w:val="0"/>
+          <w:color w:val="131226"/>
+        </w:rPr>
+        <w:t xml:space="preserve">Anforderungsaufnahme und Backlogmanagement</w:t>
+      </w:r>
+    </w:p>
+    <w:p>
+      <w:pPr/>
+      <w:r>
+        <w:rPr>
+          <w:rFonts w:ascii="Helvetica" w:hAnsi="Helvetica" w:cs="Helvetica"/>
+          <w:sz w:val="29"/>
+          <w:sz-cs w:val="29"/>
+          <w:spacing w:val="0"/>
+          <w:color w:val="131226"/>
+        </w:rPr>
+        <w:t xml:space="preserve">17 Tage</w:t>
+      </w:r>
+    </w:p>
+    <w:p>
+      <w:pPr/>
+      <w:r>
+        <w:rPr>
+          <w:rFonts w:ascii="Helvetica" w:hAnsi="Helvetica" w:cs="Helvetica"/>
+          <w:sz w:val="29"/>
+          <w:sz-cs w:val="29"/>
+          <w:spacing w:val="0"/>
+          <w:color w:val="131226"/>
+        </w:rPr>
+        <w:t xml:space="preserve">Senior Requirement Engineer</w:t>
+      </w:r>
+    </w:p>
+    <w:p>
+      <w:pPr/>
+      <w:r>
+        <w:rPr>
+          <w:rFonts w:ascii="Helvetica" w:hAnsi="Helvetica" w:cs="Helvetica"/>
+          <w:sz w:val="29"/>
+          <w:sz-cs w:val="29"/>
+          <w:spacing w:val="0"/>
+          <w:color w:val="131226"/>
+        </w:rPr>
+        <w:t xml:space="preserve">Schnittstellen- und Systemsondierungen</w:t>
+      </w:r>
+    </w:p>
+    <w:p>
+      <w:pPr/>
+      <w:r>
+        <w:rPr>
+          <w:rFonts w:ascii="Helvetica" w:hAnsi="Helvetica" w:cs="Helvetica"/>
+          <w:sz w:val="29"/>
+          <w:sz-cs w:val="29"/>
+          <w:spacing w:val="0"/>
+          <w:color w:val="131226"/>
+        </w:rPr>
+        <w:t xml:space="preserve">7 Tage</w:t>
+      </w:r>
+    </w:p>
+    <w:p>
+      <w:pPr/>
+      <w:r>
+        <w:rPr>
+          <w:rFonts w:ascii="Helvetica" w:hAnsi="Helvetica" w:cs="Helvetica"/>
+          <w:sz w:val="29"/>
+          <w:sz-cs w:val="29"/>
+          <w:spacing w:val="0"/>
+          <w:color w:val="131226"/>
+        </w:rPr>
+        <w:t xml:space="preserve">Senior Requirement Engineer</w:t>
+      </w:r>
+    </w:p>
+    <w:p>
+      <w:pPr/>
+      <w:r>
+        <w:rPr>
+          <w:rFonts w:ascii="Helvetica" w:hAnsi="Helvetica" w:cs="Helvetica"/>
+          <w:sz w:val="29"/>
+          <w:sz-cs w:val="29"/>
+          <w:spacing w:val="0"/>
+          <w:color w:val="131226"/>
+        </w:rPr>
+        <w:t xml:space="preserve">Mockup-Erstellung initiales Konzept</w:t>
+      </w:r>
+    </w:p>
+    <w:p>
+      <w:pPr/>
+      <w:r>
+        <w:rPr>
+          <w:rFonts w:ascii="Helvetica" w:hAnsi="Helvetica" w:cs="Helvetica"/>
+          <w:sz w:val="29"/>
+          <w:sz-cs w:val="29"/>
+          <w:spacing w:val="0"/>
+          <w:color w:val="131226"/>
+        </w:rPr>
+        <w:t xml:space="preserve">5 Tage</w:t>
+      </w:r>
+    </w:p>
+    <w:p>
+      <w:pPr/>
+      <w:r>
+        <w:rPr>
+          <w:rFonts w:ascii="Helvetica" w:hAnsi="Helvetica" w:cs="Helvetica"/>
+          <w:sz w:val="29"/>
+          <w:sz-cs w:val="29"/>
+          <w:spacing w:val="0"/>
+          <w:color w:val="131226"/>
+        </w:rPr>
+        <w:t xml:space="preserve">Senior Solution Architect</w:t>
+      </w:r>
+    </w:p>
+    <w:p>
+      <w:pPr/>
+      <w:r>
+        <w:rPr>
+          <w:rFonts w:ascii="Helvetica" w:hAnsi="Helvetica" w:cs="Helvetica"/>
+          <w:sz w:val="29"/>
+          <w:sz-cs w:val="29"/>
+          <w:spacing w:val="0"/>
+          <w:color w:val="131226"/>
+        </w:rPr>
+        <w:t xml:space="preserve">Data Engineering und Backend-Konfiguration</w:t>
+      </w:r>
+    </w:p>
+    <w:p>
+      <w:pPr/>
+      <w:r>
+        <w:rPr>
+          <w:rFonts w:ascii="Helvetica" w:hAnsi="Helvetica" w:cs="Helvetica"/>
+          <w:sz w:val="29"/>
+          <w:sz-cs w:val="29"/>
+          <w:spacing w:val="0"/>
+          <w:color w:val="131226"/>
+        </w:rPr>
+        <w:t xml:space="preserve">4 Tage</w:t>
+      </w:r>
+    </w:p>
+    <w:p>
+      <w:pPr/>
+      <w:r>
+        <w:rPr>
+          <w:rFonts w:ascii="Helvetica" w:hAnsi="Helvetica" w:cs="Helvetica"/>
+          <w:sz w:val="29"/>
+          <w:sz-cs w:val="29"/>
+          <w:spacing w:val="0"/>
+          <w:color w:val="131226"/>
+        </w:rPr>
+        <w:t xml:space="preserve">Senior Solution Architect</w:t>
+      </w:r>
+    </w:p>
+    <w:p>
+      <w:pPr/>
+      <w:r>
+        <w:rPr>
+          <w:rFonts w:ascii="Helvetica" w:hAnsi="Helvetica" w:cs="Helvetica"/>
+          <w:sz w:val="29"/>
+          <w:sz-cs w:val="29"/>
+          <w:spacing w:val="0"/>
+          <w:color w:val="131226"/>
+        </w:rPr>
+        <w:t xml:space="preserve">Frontend-Erstellung – iteratives Mockup-Konzept</w:t>
+      </w:r>
+    </w:p>
+    <w:p>
+      <w:pPr/>
+      <w:r>
+        <w:rPr>
+          <w:rFonts w:ascii="Helvetica" w:hAnsi="Helvetica" w:cs="Helvetica"/>
+          <w:sz w:val="29"/>
+          <w:sz-cs w:val="29"/>
+          <w:spacing w:val="0"/>
+          <w:color w:val="131226"/>
+        </w:rPr>
+        <w:t xml:space="preserve">23 Tage</w:t>
+      </w:r>
+    </w:p>
+    <w:p>
+      <w:pPr/>
+      <w:r>
+        <w:rPr>
+          <w:rFonts w:ascii="Helvetica" w:hAnsi="Helvetica" w:cs="Helvetica"/>
+          <w:sz w:val="29"/>
+          <w:sz-cs w:val="29"/>
+          <w:spacing w:val="0"/>
+          <w:color w:val="131226"/>
+        </w:rPr>
+        <w:t xml:space="preserve">Senior Solution Architect</w:t>
+      </w:r>
+    </w:p>
+    <w:p>
+      <w:pPr/>
+      <w:r>
+        <w:rPr>
+          <w:rFonts w:ascii="Helvetica" w:hAnsi="Helvetica" w:cs="Helvetica"/>
+          <w:sz w:val="29"/>
+          <w:sz-cs w:val="29"/>
+          <w:spacing w:val="0"/>
+          <w:color w:val="131226"/>
+        </w:rPr>
+        <w:t xml:space="preserve">Designworkshop</w:t>
+      </w:r>
+    </w:p>
+    <w:p>
+      <w:pPr/>
+      <w:r>
+        <w:rPr>
+          <w:rFonts w:ascii="Helvetica" w:hAnsi="Helvetica" w:cs="Helvetica"/>
+          <w:sz w:val="29"/>
+          <w:sz-cs w:val="29"/>
+          <w:spacing w:val="0"/>
+          <w:color w:val="131226"/>
+        </w:rPr>
+        <w:t xml:space="preserve">2 Tage</w:t>
+      </w:r>
+    </w:p>
+    <w:p>
+      <w:pPr/>
+      <w:r>
+        <w:rPr>
+          <w:rFonts w:ascii="Helvetica" w:hAnsi="Helvetica" w:cs="Helvetica"/>
+          <w:sz w:val="29"/>
+          <w:sz-cs w:val="29"/>
+          <w:spacing w:val="0"/>
+          <w:color w:val="131226"/>
+        </w:rPr>
+        <w:t xml:space="preserve">Senior Solution Architect / Senior Requirement Engineer</w:t>
+      </w:r>
+    </w:p>
+    <w:p>
+      <w:pPr/>
+      <w:r>
+        <w:rPr>
+          <w:rFonts w:ascii="Helvetica" w:hAnsi="Helvetica" w:cs="Helvetica"/>
+          <w:sz w:val="29"/>
+          <w:sz-cs w:val="29"/>
+          <w:b/>
+          <w:spacing w:val="0"/>
+          <w:color w:val="131226"/>
+        </w:rPr>
+        <w:t xml:space="preserve">Gesamtaufwendungen</w:t>
+      </w:r>
+      <w:r>
+        <w:rPr>
+          <w:rFonts w:ascii="Helvetica" w:hAnsi="Helvetica" w:cs="Helvetica"/>
+          <w:sz w:val="29"/>
+          <w:sz-cs w:val="29"/>
+          <w:spacing w:val="0"/>
+          <w:color w:val="131226"/>
+        </w:rPr>
+        <w:t xml:space="preserve"/>
+      </w:r>
+    </w:p>
+    <w:p>
+      <w:pPr/>
+      <w:r>
+        <w:rPr>
+          <w:rFonts w:ascii="Helvetica" w:hAnsi="Helvetica" w:cs="Helvetica"/>
+          <w:sz w:val="29"/>
+          <w:sz-cs w:val="29"/>
+          <w:b/>
+          <w:spacing w:val="0"/>
+          <w:color w:val="131226"/>
+        </w:rPr>
+        <w:t xml:space="preserve">65 Tage</w:t>
+      </w:r>
+      <w:r>
+        <w:rPr>
+          <w:rFonts w:ascii="Helvetica" w:hAnsi="Helvetica" w:cs="Helvetica"/>
+          <w:sz w:val="29"/>
+          <w:sz-cs w:val="29"/>
+          <w:spacing w:val="0"/>
+          <w:color w:val="131226"/>
+        </w:rPr>
+        <w:t xml:space="preserve"/>
+      </w:r>
+    </w:p>
+    <w:p>
+      <w:pPr/>
+      <w:r>
+        <w:rPr>
+          <w:rFonts w:ascii="Helvetica" w:hAnsi="Helvetica" w:cs="Helvetica"/>
+          <w:sz w:val="29"/>
+          <w:sz-cs w:val="29"/>
+          <w:spacing w:val="0"/>
+          <w:color w:val="131226"/>
+        </w:rPr>
+        <w:t xml:space="preserve"/>
+      </w:r>
+    </w:p>
+    <w:p>
+      <w:pPr>
+        <w:spacing w:after="293"/>
+      </w:pPr>
+      <w:r>
+        <w:rPr>
+          <w:rFonts w:ascii="Helvetica" w:hAnsi="Helvetica" w:cs="Helvetica"/>
+          <w:sz w:val="29"/>
+          <w:sz-cs w:val="29"/>
+          <w:b/>
+          <w:spacing w:val="0"/>
+          <w:color w:val="131226"/>
+        </w:rPr>
+        <w:t xml:space="preserve">Nächster Schritt:</w:t>
+      </w:r>
+      <w:r>
+        <w:rPr>
+          <w:rFonts w:ascii="Helvetica" w:hAnsi="Helvetica" w:cs="Helvetica"/>
+          <w:sz w:val="29"/>
+          <w:sz-cs w:val="29"/>
+          <w:spacing w:val="0"/>
+          <w:color w:val="131226"/>
+        </w:rPr>
+        <w:t xml:space="preserve"> Auf Basis von Prototyp und Spezifikation bindet die Folgephase die externen Schnittstellen (CDH, Jira, MIA, WMM) an — so wird aus dem heutigen Prototyp die durchgängig automatisierte, produktive Lösung.</w:t>
       </w:r>
     </w:p>
     <w:p>

</xml_diff>